<commit_message>
update final report aobut datasets
</commit_message>
<xml_diff>
--- a/docs/final report.docx
+++ b/docs/final report.docx
@@ -2469,7 +2469,20 @@
           <w:sz w:val="32"/>
           <w:szCs w:val="32"/>
         </w:rPr>
-        <w:t xml:space="preserve">3. Main results</w:t>
+        <w:t xml:space="preserve">3. How the text was obtained, dataset by dataset</w:t>
+      </w:r>
+    </w:p>
+    <w:p>
+      <w:pPr>
+        <w:spacing w:after="120"/>
+      </w:pPr>
+      <w:r>
+        <w:rPr>
+          <w:rFonts w:ascii="Calibri" w:cs="Calibri" w:eastAsia="Calibri" w:hAnsi="Calibri"/>
+          <w:sz w:val="22"/>
+          <w:szCs w:val="22"/>
+        </w:rPr>
+        <w:t xml:space="preserve">FLAG needs text for every node: raw text for the text branch, and LLM-generated "discriminative" and "residual" text for the dual branch. Only Reddit and Instagram ship with text. For the other three datasets the raw text had to be recovered or built, and the prompts had to be written. This section explains both steps for each dataset.</w:t>
       </w:r>
     </w:p>
     <w:p>
@@ -2486,7 +2499,2674 @@
           <w:sz w:val="26"/>
           <w:szCs w:val="26"/>
         </w:rPr>
-        <w:t xml:space="preserve">3.1 Mean test AUC and F1-macro over the seven backbones</w:t>
+        <w:t xml:space="preserve">3.1 The shared LLM stage</w:t>
+      </w:r>
+    </w:p>
+    <w:p>
+      <w:pPr>
+        <w:spacing w:after="120"/>
+      </w:pPr>
+      <w:r>
+        <w:rPr>
+          <w:rFonts w:ascii="Calibri" w:cs="Calibri" w:eastAsia="Calibri" w:hAnsi="Calibri"/>
+          <w:sz w:val="22"/>
+          <w:szCs w:val="22"/>
+        </w:rPr>
+        <w:t xml:space="preserve">Once a node has raw text, the LLM stage is the same for every dataset:</w:t>
+      </w:r>
+    </w:p>
+    <w:p>
+      <w:pPr>
+        <w:pStyle w:val="ListParagraph"/>
+        <w:numPr>
+          <w:ilvl w:val="0"/>
+          <w:numId w:val="2"/>
+        </w:numPr>
+        <w:spacing w:after="80"/>
+      </w:pPr>
+      <w:r>
+        <w:rPr>
+          <w:rFonts w:ascii="Calibri" w:cs="Calibri" w:eastAsia="Calibri" w:hAnsi="Calibri"/>
+          <w:sz w:val="22"/>
+          <w:szCs w:val="22"/>
+        </w:rPr>
+        <w:t xml:space="preserve">Sampling. For each node, a neighbour sampler picks a small subgraph around it: the paper’s cosine sampler or FLAG-MD. The size limit is top-10 on Reddit and Instagram and top-3 on the three review datasets.</w:t>
+      </w:r>
+    </w:p>
+    <w:p>
+      <w:pPr>
+        <w:pStyle w:val="ListParagraph"/>
+        <w:numPr>
+          <w:ilvl w:val="0"/>
+          <w:numId w:val="2"/>
+        </w:numPr>
+        <w:spacing w:after="80"/>
+      </w:pPr>
+      <w:r>
+        <w:rPr>
+          <w:rFonts w:ascii="Calibri" w:cs="Calibri" w:eastAsia="Calibri" w:hAnsi="Calibri"/>
+          <w:sz w:val="22"/>
+          <w:szCs w:val="22"/>
+        </w:rPr>
+        <w:t xml:space="preserve">Prompt. All node texts in the subgraph are listed as "1. [text of node 1], 2. [text of node 2], …" and sent in one prompt. Two prompts are used, one for discriminative text and one for residual text, each preceded by a short system instruction.</w:t>
+      </w:r>
+    </w:p>
+    <w:p>
+      <w:pPr>
+        <w:pStyle w:val="ListParagraph"/>
+        <w:numPr>
+          <w:ilvl w:val="0"/>
+          <w:numId w:val="2"/>
+        </w:numPr>
+        <w:spacing w:after="80"/>
+      </w:pPr>
+      <w:r>
+        <w:rPr>
+          <w:rFonts w:ascii="Calibri" w:cs="Calibri" w:eastAsia="Calibri" w:hAnsi="Calibri"/>
+          <w:sz w:val="22"/>
+          <w:szCs w:val="22"/>
+        </w:rPr>
+        <w:t xml:space="preserve">Generation. google/gemma-2-9b-it generates the answer with vLLM in bfloat16, greedy decoding, at most 550 new tokens, with each node’s text cut to 1,200 characters. The model must write exactly one line per node.</w:t>
+      </w:r>
+    </w:p>
+    <w:p>
+      <w:pPr>
+        <w:pStyle w:val="ListParagraph"/>
+        <w:numPr>
+          <w:ilvl w:val="0"/>
+          <w:numId w:val="2"/>
+        </w:numPr>
+        <w:spacing w:after="80"/>
+      </w:pPr>
+      <w:r>
+        <w:rPr>
+          <w:rFonts w:ascii="Calibri" w:cs="Calibri" w:eastAsia="Calibri" w:hAnsi="Calibri"/>
+          <w:sz w:val="22"/>
+          <w:szCs w:val="22"/>
+        </w:rPr>
+        <w:t xml:space="preserve">Format check. The answer is split into lines. If the line count does not match the number of nodes, the whole subgraph’s output is discarded and those nodes fall back to their raw text.</w:t>
+      </w:r>
+    </w:p>
+    <w:p>
+      <w:pPr>
+        <w:pStyle w:val="ListParagraph"/>
+        <w:numPr>
+          <w:ilvl w:val="0"/>
+          <w:numId w:val="2"/>
+        </w:numPr>
+        <w:spacing w:after="80"/>
+      </w:pPr>
+      <w:r>
+        <w:rPr>
+          <w:rFonts w:ascii="Calibri" w:cs="Calibri" w:eastAsia="Calibri" w:hAnsi="Calibri"/>
+          <w:sz w:val="22"/>
+          <w:szCs w:val="22"/>
+        </w:rPr>
+        <w:t xml:space="preserve">Encoding and replay. The surviving lines are encoded with Sentence-BERT (384-d) and cached. Every backbone, seed and initialisation reuses the same cache, so LLM noise is generated once.</w:t>
+      </w:r>
+    </w:p>
+    <w:p>
+      <w:pPr>
+        <w:spacing w:after="120"/>
+      </w:pPr>
+      <w:r>
+        <w:rPr>
+          <w:rFonts w:ascii="Calibri" w:cs="Calibri" w:eastAsia="Calibri" w:hAnsi="Calibri"/>
+          <w:sz w:val="22"/>
+          <w:szCs w:val="22"/>
+        </w:rPr>
+        <w:t xml:space="preserve">Subgraph size decides how well this works. A subgraph with 35 or more nodes cannot fit 35 or more lines into 550 tokens, so large subgraphs often fail the format check and fall back to raw text. This is why coverage differs so much across datasets (Table 3a).</w:t>
+      </w:r>
+    </w:p>
+    <w:p>
+      <w:pPr>
+        <w:keepNext/>
+        <w:spacing w:after="80" w:before="160"/>
+      </w:pPr>
+      <w:r>
+        <w:rPr>
+          <w:rFonts w:ascii="Calibri" w:cs="Calibri" w:eastAsia="Calibri" w:hAnsi="Calibri"/>
+          <w:i/>
+          <w:iCs/>
+          <w:color w:val="444444"/>
+          <w:sz w:val="20"/>
+          <w:szCs w:val="20"/>
+        </w:rPr>
+        <w:t xml:space="preserve">Table 3a. Share of nodes with LLM-generated text (cosine sampler; FLAG-MD is within 1 pp).</w:t>
+      </w:r>
+    </w:p>
+    <w:tbl>
+      <w:tblPr>
+        <w:tblW w:type="dxa" w:w="9360"/>
+        <w:tblBorders>
+          <w:top w:val="single" w:color="auto" w:sz="4"/>
+          <w:left w:val="single" w:color="auto" w:sz="4"/>
+          <w:bottom w:val="single" w:color="auto" w:sz="4"/>
+          <w:right w:val="single" w:color="auto" w:sz="4"/>
+          <w:insideH w:val="single" w:color="auto" w:sz="4"/>
+          <w:insideV w:val="single" w:color="auto" w:sz="4"/>
+        </w:tblBorders>
+      </w:tblPr>
+      <w:tblGrid>
+        <w:gridCol w:w="1800"/>
+        <w:gridCol w:w="2700"/>
+        <w:gridCol w:w="2430"/>
+        <w:gridCol w:w="2430"/>
+      </w:tblGrid>
+      <w:tr>
+        <w:trPr>
+          <w:tblHeader/>
+        </w:trPr>
+        <w:tc>
+          <w:tcPr>
+            <w:tcW w:type="dxa" w:w="1800"/>
+            <w:tcBorders>
+              <w:top w:val="single" w:color="BFBFBF" w:sz="4"/>
+              <w:left w:val="single" w:color="BFBFBF" w:sz="4"/>
+              <w:bottom w:val="single" w:color="BFBFBF" w:sz="4"/>
+              <w:right w:val="single" w:color="BFBFBF" w:sz="4"/>
+            </w:tcBorders>
+            <w:shd w:fill="1F3864" w:color="auto" w:val="clear"/>
+            <w:tcMar>
+              <w:top w:type="dxa" w:w="50"/>
+              <w:left w:type="dxa" w:w="80"/>
+              <w:bottom w:type="dxa" w:w="50"/>
+              <w:right w:type="dxa" w:w="80"/>
+            </w:tcMar>
+          </w:tcPr>
+          <w:p>
+            <w:pPr>
+              <w:jc w:val="left"/>
+            </w:pPr>
+            <w:r>
+              <w:rPr>
+                <w:rFonts w:ascii="Calibri" w:cs="Calibri" w:eastAsia="Calibri" w:hAnsi="Calibri"/>
+                <w:b/>
+                <w:bCs/>
+                <w:color w:val="FFFFFF"/>
+                <w:sz w:val="18"/>
+                <w:szCs w:val="18"/>
+              </w:rPr>
+              <w:t xml:space="preserve">Dataset</w:t>
+            </w:r>
+          </w:p>
+        </w:tc>
+        <w:tc>
+          <w:tcPr>
+            <w:tcW w:type="dxa" w:w="2700"/>
+            <w:tcBorders>
+              <w:top w:val="single" w:color="BFBFBF" w:sz="4"/>
+              <w:left w:val="single" w:color="BFBFBF" w:sz="4"/>
+              <w:bottom w:val="single" w:color="BFBFBF" w:sz="4"/>
+              <w:right w:val="single" w:color="BFBFBF" w:sz="4"/>
+            </w:tcBorders>
+            <w:shd w:fill="1F3864" w:color="auto" w:val="clear"/>
+            <w:tcMar>
+              <w:top w:type="dxa" w:w="50"/>
+              <w:left w:type="dxa" w:w="80"/>
+              <w:bottom w:type="dxa" w:w="50"/>
+              <w:right w:type="dxa" w:w="80"/>
+            </w:tcMar>
+          </w:tcPr>
+          <w:p>
+            <w:pPr>
+              <w:jc w:val="center"/>
+            </w:pPr>
+            <w:r>
+              <w:rPr>
+                <w:rFonts w:ascii="Calibri" w:cs="Calibri" w:eastAsia="Calibri" w:hAnsi="Calibri"/>
+                <w:b/>
+                <w:bCs/>
+                <w:color w:val="FFFFFF"/>
+                <w:sz w:val="18"/>
+                <w:szCs w:val="18"/>
+              </w:rPr>
+              <w:t xml:space="preserve">Subgraph size</w:t>
+            </w:r>
+          </w:p>
+        </w:tc>
+        <w:tc>
+          <w:tcPr>
+            <w:tcW w:type="dxa" w:w="2430"/>
+            <w:tcBorders>
+              <w:top w:val="single" w:color="BFBFBF" w:sz="4"/>
+              <w:left w:val="single" w:color="BFBFBF" w:sz="4"/>
+              <w:bottom w:val="single" w:color="BFBFBF" w:sz="4"/>
+              <w:right w:val="single" w:color="BFBFBF" w:sz="4"/>
+            </w:tcBorders>
+            <w:shd w:fill="1F3864" w:color="auto" w:val="clear"/>
+            <w:tcMar>
+              <w:top w:type="dxa" w:w="50"/>
+              <w:left w:type="dxa" w:w="80"/>
+              <w:bottom w:type="dxa" w:w="50"/>
+              <w:right w:type="dxa" w:w="80"/>
+            </w:tcMar>
+          </w:tcPr>
+          <w:p>
+            <w:pPr>
+              <w:jc w:val="center"/>
+            </w:pPr>
+            <w:r>
+              <w:rPr>
+                <w:rFonts w:ascii="Calibri" w:cs="Calibri" w:eastAsia="Calibri" w:hAnsi="Calibri"/>
+                <w:b/>
+                <w:bCs/>
+                <w:color w:val="FFFFFF"/>
+                <w:sz w:val="18"/>
+                <w:szCs w:val="18"/>
+              </w:rPr>
+              <w:t xml:space="preserve">Discriminative text</w:t>
+            </w:r>
+          </w:p>
+        </w:tc>
+        <w:tc>
+          <w:tcPr>
+            <w:tcW w:type="dxa" w:w="2430"/>
+            <w:tcBorders>
+              <w:top w:val="single" w:color="BFBFBF" w:sz="4"/>
+              <w:left w:val="single" w:color="BFBFBF" w:sz="4"/>
+              <w:bottom w:val="single" w:color="BFBFBF" w:sz="4"/>
+              <w:right w:val="single" w:color="BFBFBF" w:sz="4"/>
+            </w:tcBorders>
+            <w:shd w:fill="1F3864" w:color="auto" w:val="clear"/>
+            <w:tcMar>
+              <w:top w:type="dxa" w:w="50"/>
+              <w:left w:type="dxa" w:w="80"/>
+              <w:bottom w:type="dxa" w:w="50"/>
+              <w:right w:type="dxa" w:w="80"/>
+            </w:tcMar>
+          </w:tcPr>
+          <w:p>
+            <w:pPr>
+              <w:jc w:val="center"/>
+            </w:pPr>
+            <w:r>
+              <w:rPr>
+                <w:rFonts w:ascii="Calibri" w:cs="Calibri" w:eastAsia="Calibri" w:hAnsi="Calibri"/>
+                <w:b/>
+                <w:bCs/>
+                <w:color w:val="FFFFFF"/>
+                <w:sz w:val="18"/>
+                <w:szCs w:val="18"/>
+              </w:rPr>
+              <w:t xml:space="preserve">Residual text</w:t>
+            </w:r>
+          </w:p>
+        </w:tc>
+      </w:tr>
+      <w:tr>
+        <w:trPr>
+          <w:cantSplit/>
+        </w:trPr>
+        <w:tc>
+          <w:tcPr>
+            <w:tcW w:type="dxa" w:w="1800"/>
+            <w:tcBorders>
+              <w:top w:val="single" w:color="BFBFBF" w:sz="4"/>
+              <w:left w:val="single" w:color="BFBFBF" w:sz="4"/>
+              <w:bottom w:val="single" w:color="BFBFBF" w:sz="4"/>
+              <w:right w:val="single" w:color="BFBFBF" w:sz="4"/>
+            </w:tcBorders>
+            <w:tcMar>
+              <w:top w:type="dxa" w:w="50"/>
+              <w:left w:type="dxa" w:w="80"/>
+              <w:bottom w:type="dxa" w:w="50"/>
+              <w:right w:type="dxa" w:w="80"/>
+            </w:tcMar>
+          </w:tcPr>
+          <w:p>
+            <w:pPr>
+              <w:jc w:val="left"/>
+            </w:pPr>
+            <w:r>
+              <w:rPr>
+                <w:rFonts w:ascii="Calibri" w:cs="Calibri" w:eastAsia="Calibri" w:hAnsi="Calibri"/>
+                <w:b w:val="false"/>
+                <w:bCs w:val="false"/>
+                <w:sz w:val="18"/>
+                <w:szCs w:val="18"/>
+              </w:rPr>
+              <w:t xml:space="preserve">Reddit</w:t>
+            </w:r>
+          </w:p>
+        </w:tc>
+        <w:tc>
+          <w:tcPr>
+            <w:tcW w:type="dxa" w:w="2700"/>
+            <w:tcBorders>
+              <w:top w:val="single" w:color="BFBFBF" w:sz="4"/>
+              <w:left w:val="single" w:color="BFBFBF" w:sz="4"/>
+              <w:bottom w:val="single" w:color="BFBFBF" w:sz="4"/>
+              <w:right w:val="single" w:color="BFBFBF" w:sz="4"/>
+            </w:tcBorders>
+            <w:tcMar>
+              <w:top w:type="dxa" w:w="50"/>
+              <w:left w:type="dxa" w:w="80"/>
+              <w:bottom w:type="dxa" w:w="50"/>
+              <w:right w:type="dxa" w:w="80"/>
+            </w:tcMar>
+          </w:tcPr>
+          <w:p>
+            <w:pPr>
+              <w:jc w:val="center"/>
+            </w:pPr>
+            <w:r>
+              <w:rPr>
+                <w:rFonts w:ascii="Calibri" w:cs="Calibri" w:eastAsia="Calibri" w:hAnsi="Calibri"/>
+                <w:b w:val="false"/>
+                <w:bCs w:val="false"/>
+                <w:sz w:val="18"/>
+                <w:szCs w:val="18"/>
+              </w:rPr>
+              <w:t xml:space="preserve">top-10; mean 9 nodes</w:t>
+            </w:r>
+          </w:p>
+        </w:tc>
+        <w:tc>
+          <w:tcPr>
+            <w:tcW w:type="dxa" w:w="2430"/>
+            <w:tcBorders>
+              <w:top w:val="single" w:color="BFBFBF" w:sz="4"/>
+              <w:left w:val="single" w:color="BFBFBF" w:sz="4"/>
+              <w:bottom w:val="single" w:color="BFBFBF" w:sz="4"/>
+              <w:right w:val="single" w:color="BFBFBF" w:sz="4"/>
+            </w:tcBorders>
+            <w:tcMar>
+              <w:top w:type="dxa" w:w="50"/>
+              <w:left w:type="dxa" w:w="80"/>
+              <w:bottom w:type="dxa" w:w="50"/>
+              <w:right w:type="dxa" w:w="80"/>
+            </w:tcMar>
+          </w:tcPr>
+          <w:p>
+            <w:pPr>
+              <w:jc w:val="center"/>
+            </w:pPr>
+            <w:r>
+              <w:rPr>
+                <w:rFonts w:ascii="Calibri" w:cs="Calibri" w:eastAsia="Calibri" w:hAnsi="Calibri"/>
+                <w:b w:val="false"/>
+                <w:bCs w:val="false"/>
+                <w:sz w:val="18"/>
+                <w:szCs w:val="18"/>
+              </w:rPr>
+              <w:t xml:space="preserve">55.5%</w:t>
+            </w:r>
+          </w:p>
+        </w:tc>
+        <w:tc>
+          <w:tcPr>
+            <w:tcW w:type="dxa" w:w="2430"/>
+            <w:tcBorders>
+              <w:top w:val="single" w:color="BFBFBF" w:sz="4"/>
+              <w:left w:val="single" w:color="BFBFBF" w:sz="4"/>
+              <w:bottom w:val="single" w:color="BFBFBF" w:sz="4"/>
+              <w:right w:val="single" w:color="BFBFBF" w:sz="4"/>
+            </w:tcBorders>
+            <w:tcMar>
+              <w:top w:type="dxa" w:w="50"/>
+              <w:left w:type="dxa" w:w="80"/>
+              <w:bottom w:type="dxa" w:w="50"/>
+              <w:right w:type="dxa" w:w="80"/>
+            </w:tcMar>
+          </w:tcPr>
+          <w:p>
+            <w:pPr>
+              <w:jc w:val="center"/>
+            </w:pPr>
+            <w:r>
+              <w:rPr>
+                <w:rFonts w:ascii="Calibri" w:cs="Calibri" w:eastAsia="Calibri" w:hAnsi="Calibri"/>
+                <w:b w:val="false"/>
+                <w:bCs w:val="false"/>
+                <w:sz w:val="18"/>
+                <w:szCs w:val="18"/>
+              </w:rPr>
+              <w:t xml:space="preserve">72.5%</w:t>
+            </w:r>
+          </w:p>
+        </w:tc>
+      </w:tr>
+      <w:tr>
+        <w:trPr>
+          <w:cantSplit/>
+        </w:trPr>
+        <w:tc>
+          <w:tcPr>
+            <w:tcW w:type="dxa" w:w="1800"/>
+            <w:tcBorders>
+              <w:top w:val="single" w:color="BFBFBF" w:sz="4"/>
+              <w:left w:val="single" w:color="BFBFBF" w:sz="4"/>
+              <w:bottom w:val="single" w:color="BFBFBF" w:sz="4"/>
+              <w:right w:val="single" w:color="BFBFBF" w:sz="4"/>
+            </w:tcBorders>
+            <w:shd w:fill="F7F7F7" w:color="auto" w:val="clear"/>
+            <w:tcMar>
+              <w:top w:type="dxa" w:w="50"/>
+              <w:left w:type="dxa" w:w="80"/>
+              <w:bottom w:type="dxa" w:w="50"/>
+              <w:right w:type="dxa" w:w="80"/>
+            </w:tcMar>
+          </w:tcPr>
+          <w:p>
+            <w:pPr>
+              <w:jc w:val="left"/>
+            </w:pPr>
+            <w:r>
+              <w:rPr>
+                <w:rFonts w:ascii="Calibri" w:cs="Calibri" w:eastAsia="Calibri" w:hAnsi="Calibri"/>
+                <w:b w:val="false"/>
+                <w:bCs w:val="false"/>
+                <w:sz w:val="18"/>
+                <w:szCs w:val="18"/>
+              </w:rPr>
+              <w:t xml:space="preserve">Instagram</w:t>
+            </w:r>
+          </w:p>
+        </w:tc>
+        <w:tc>
+          <w:tcPr>
+            <w:tcW w:type="dxa" w:w="2700"/>
+            <w:tcBorders>
+              <w:top w:val="single" w:color="BFBFBF" w:sz="4"/>
+              <w:left w:val="single" w:color="BFBFBF" w:sz="4"/>
+              <w:bottom w:val="single" w:color="BFBFBF" w:sz="4"/>
+              <w:right w:val="single" w:color="BFBFBF" w:sz="4"/>
+            </w:tcBorders>
+            <w:shd w:fill="F7F7F7" w:color="auto" w:val="clear"/>
+            <w:tcMar>
+              <w:top w:type="dxa" w:w="50"/>
+              <w:left w:type="dxa" w:w="80"/>
+              <w:bottom w:type="dxa" w:w="50"/>
+              <w:right w:type="dxa" w:w="80"/>
+            </w:tcMar>
+          </w:tcPr>
+          <w:p>
+            <w:pPr>
+              <w:jc w:val="center"/>
+            </w:pPr>
+            <w:r>
+              <w:rPr>
+                <w:rFonts w:ascii="Calibri" w:cs="Calibri" w:eastAsia="Calibri" w:hAnsi="Calibri"/>
+                <w:b w:val="false"/>
+                <w:bCs w:val="false"/>
+                <w:sz w:val="18"/>
+                <w:szCs w:val="18"/>
+              </w:rPr>
+              <w:t xml:space="preserve">top-10; median 35 nodes</w:t>
+            </w:r>
+          </w:p>
+        </w:tc>
+        <w:tc>
+          <w:tcPr>
+            <w:tcW w:type="dxa" w:w="2430"/>
+            <w:tcBorders>
+              <w:top w:val="single" w:color="BFBFBF" w:sz="4"/>
+              <w:left w:val="single" w:color="BFBFBF" w:sz="4"/>
+              <w:bottom w:val="single" w:color="BFBFBF" w:sz="4"/>
+              <w:right w:val="single" w:color="BFBFBF" w:sz="4"/>
+            </w:tcBorders>
+            <w:shd w:fill="F7F7F7" w:color="auto" w:val="clear"/>
+            <w:tcMar>
+              <w:top w:type="dxa" w:w="50"/>
+              <w:left w:type="dxa" w:w="80"/>
+              <w:bottom w:type="dxa" w:w="50"/>
+              <w:right w:type="dxa" w:w="80"/>
+            </w:tcMar>
+          </w:tcPr>
+          <w:p>
+            <w:pPr>
+              <w:jc w:val="center"/>
+            </w:pPr>
+            <w:r>
+              <w:rPr>
+                <w:rFonts w:ascii="Calibri" w:cs="Calibri" w:eastAsia="Calibri" w:hAnsi="Calibri"/>
+                <w:b w:val="false"/>
+                <w:bCs w:val="false"/>
+                <w:sz w:val="18"/>
+                <w:szCs w:val="18"/>
+              </w:rPr>
+              <w:t xml:space="preserve">9.1%</w:t>
+            </w:r>
+          </w:p>
+        </w:tc>
+        <w:tc>
+          <w:tcPr>
+            <w:tcW w:type="dxa" w:w="2430"/>
+            <w:tcBorders>
+              <w:top w:val="single" w:color="BFBFBF" w:sz="4"/>
+              <w:left w:val="single" w:color="BFBFBF" w:sz="4"/>
+              <w:bottom w:val="single" w:color="BFBFBF" w:sz="4"/>
+              <w:right w:val="single" w:color="BFBFBF" w:sz="4"/>
+            </w:tcBorders>
+            <w:shd w:fill="F7F7F7" w:color="auto" w:val="clear"/>
+            <w:tcMar>
+              <w:top w:type="dxa" w:w="50"/>
+              <w:left w:type="dxa" w:w="80"/>
+              <w:bottom w:type="dxa" w:w="50"/>
+              <w:right w:type="dxa" w:w="80"/>
+            </w:tcMar>
+          </w:tcPr>
+          <w:p>
+            <w:pPr>
+              <w:jc w:val="center"/>
+            </w:pPr>
+            <w:r>
+              <w:rPr>
+                <w:rFonts w:ascii="Calibri" w:cs="Calibri" w:eastAsia="Calibri" w:hAnsi="Calibri"/>
+                <w:b w:val="false"/>
+                <w:bCs w:val="false"/>
+                <w:sz w:val="18"/>
+                <w:szCs w:val="18"/>
+              </w:rPr>
+              <w:t xml:space="preserve">20.7%</w:t>
+            </w:r>
+          </w:p>
+        </w:tc>
+      </w:tr>
+      <w:tr>
+        <w:trPr>
+          <w:cantSplit/>
+        </w:trPr>
+        <w:tc>
+          <w:tcPr>
+            <w:tcW w:type="dxa" w:w="1800"/>
+            <w:tcBorders>
+              <w:top w:val="single" w:color="BFBFBF" w:sz="4"/>
+              <w:left w:val="single" w:color="BFBFBF" w:sz="4"/>
+              <w:bottom w:val="single" w:color="BFBFBF" w:sz="4"/>
+              <w:right w:val="single" w:color="BFBFBF" w:sz="4"/>
+            </w:tcBorders>
+            <w:tcMar>
+              <w:top w:type="dxa" w:w="50"/>
+              <w:left w:type="dxa" w:w="80"/>
+              <w:bottom w:type="dxa" w:w="50"/>
+              <w:right w:type="dxa" w:w="80"/>
+            </w:tcMar>
+          </w:tcPr>
+          <w:p>
+            <w:pPr>
+              <w:jc w:val="left"/>
+            </w:pPr>
+            <w:r>
+              <w:rPr>
+                <w:rFonts w:ascii="Calibri" w:cs="Calibri" w:eastAsia="Calibri" w:hAnsi="Calibri"/>
+                <w:b w:val="false"/>
+                <w:bCs w:val="false"/>
+                <w:sz w:val="18"/>
+                <w:szCs w:val="18"/>
+              </w:rPr>
+              <w:t xml:space="preserve">Amazon</w:t>
+            </w:r>
+          </w:p>
+        </w:tc>
+        <w:tc>
+          <w:tcPr>
+            <w:tcW w:type="dxa" w:w="2700"/>
+            <w:tcBorders>
+              <w:top w:val="single" w:color="BFBFBF" w:sz="4"/>
+              <w:left w:val="single" w:color="BFBFBF" w:sz="4"/>
+              <w:bottom w:val="single" w:color="BFBFBF" w:sz="4"/>
+              <w:right w:val="single" w:color="BFBFBF" w:sz="4"/>
+            </w:tcBorders>
+            <w:tcMar>
+              <w:top w:type="dxa" w:w="50"/>
+              <w:left w:type="dxa" w:w="80"/>
+              <w:bottom w:type="dxa" w:w="50"/>
+              <w:right w:type="dxa" w:w="80"/>
+            </w:tcMar>
+          </w:tcPr>
+          <w:p>
+            <w:pPr>
+              <w:jc w:val="center"/>
+            </w:pPr>
+            <w:r>
+              <w:rPr>
+                <w:rFonts w:ascii="Calibri" w:cs="Calibri" w:eastAsia="Calibri" w:hAnsi="Calibri"/>
+                <w:b w:val="false"/>
+                <w:bCs w:val="false"/>
+                <w:sz w:val="18"/>
+                <w:szCs w:val="18"/>
+              </w:rPr>
+              <w:t xml:space="preserve">top-3; at most 13 nodes</w:t>
+            </w:r>
+          </w:p>
+        </w:tc>
+        <w:tc>
+          <w:tcPr>
+            <w:tcW w:type="dxa" w:w="2430"/>
+            <w:tcBorders>
+              <w:top w:val="single" w:color="BFBFBF" w:sz="4"/>
+              <w:left w:val="single" w:color="BFBFBF" w:sz="4"/>
+              <w:bottom w:val="single" w:color="BFBFBF" w:sz="4"/>
+              <w:right w:val="single" w:color="BFBFBF" w:sz="4"/>
+            </w:tcBorders>
+            <w:tcMar>
+              <w:top w:type="dxa" w:w="50"/>
+              <w:left w:type="dxa" w:w="80"/>
+              <w:bottom w:type="dxa" w:w="50"/>
+              <w:right w:type="dxa" w:w="80"/>
+            </w:tcMar>
+          </w:tcPr>
+          <w:p>
+            <w:pPr>
+              <w:jc w:val="center"/>
+            </w:pPr>
+            <w:r>
+              <w:rPr>
+                <w:rFonts w:ascii="Calibri" w:cs="Calibri" w:eastAsia="Calibri" w:hAnsi="Calibri"/>
+                <w:b w:val="false"/>
+                <w:bCs w:val="false"/>
+                <w:sz w:val="18"/>
+                <w:szCs w:val="18"/>
+              </w:rPr>
+              <w:t xml:space="preserve">97.5%</w:t>
+            </w:r>
+          </w:p>
+        </w:tc>
+        <w:tc>
+          <w:tcPr>
+            <w:tcW w:type="dxa" w:w="2430"/>
+            <w:tcBorders>
+              <w:top w:val="single" w:color="BFBFBF" w:sz="4"/>
+              <w:left w:val="single" w:color="BFBFBF" w:sz="4"/>
+              <w:bottom w:val="single" w:color="BFBFBF" w:sz="4"/>
+              <w:right w:val="single" w:color="BFBFBF" w:sz="4"/>
+            </w:tcBorders>
+            <w:tcMar>
+              <w:top w:type="dxa" w:w="50"/>
+              <w:left w:type="dxa" w:w="80"/>
+              <w:bottom w:type="dxa" w:w="50"/>
+              <w:right w:type="dxa" w:w="80"/>
+            </w:tcMar>
+          </w:tcPr>
+          <w:p>
+            <w:pPr>
+              <w:jc w:val="center"/>
+            </w:pPr>
+            <w:r>
+              <w:rPr>
+                <w:rFonts w:ascii="Calibri" w:cs="Calibri" w:eastAsia="Calibri" w:hAnsi="Calibri"/>
+                <w:b w:val="false"/>
+                <w:bCs w:val="false"/>
+                <w:sz w:val="18"/>
+                <w:szCs w:val="18"/>
+              </w:rPr>
+              <w:t xml:space="preserve">99.1%</w:t>
+            </w:r>
+          </w:p>
+        </w:tc>
+      </w:tr>
+      <w:tr>
+        <w:trPr>
+          <w:cantSplit/>
+        </w:trPr>
+        <w:tc>
+          <w:tcPr>
+            <w:tcW w:type="dxa" w:w="1800"/>
+            <w:tcBorders>
+              <w:top w:val="single" w:color="BFBFBF" w:sz="4"/>
+              <w:left w:val="single" w:color="BFBFBF" w:sz="4"/>
+              <w:bottom w:val="single" w:color="BFBFBF" w:sz="4"/>
+              <w:right w:val="single" w:color="BFBFBF" w:sz="4"/>
+            </w:tcBorders>
+            <w:shd w:fill="F7F7F7" w:color="auto" w:val="clear"/>
+            <w:tcMar>
+              <w:top w:type="dxa" w:w="50"/>
+              <w:left w:type="dxa" w:w="80"/>
+              <w:bottom w:type="dxa" w:w="50"/>
+              <w:right w:type="dxa" w:w="80"/>
+            </w:tcMar>
+          </w:tcPr>
+          <w:p>
+            <w:pPr>
+              <w:jc w:val="left"/>
+            </w:pPr>
+            <w:r>
+              <w:rPr>
+                <w:rFonts w:ascii="Calibri" w:cs="Calibri" w:eastAsia="Calibri" w:hAnsi="Calibri"/>
+                <w:b w:val="false"/>
+                <w:bCs w:val="false"/>
+                <w:sz w:val="18"/>
+                <w:szCs w:val="18"/>
+              </w:rPr>
+              <w:t xml:space="preserve">YelpChi</w:t>
+            </w:r>
+          </w:p>
+        </w:tc>
+        <w:tc>
+          <w:tcPr>
+            <w:tcW w:type="dxa" w:w="2700"/>
+            <w:tcBorders>
+              <w:top w:val="single" w:color="BFBFBF" w:sz="4"/>
+              <w:left w:val="single" w:color="BFBFBF" w:sz="4"/>
+              <w:bottom w:val="single" w:color="BFBFBF" w:sz="4"/>
+              <w:right w:val="single" w:color="BFBFBF" w:sz="4"/>
+            </w:tcBorders>
+            <w:shd w:fill="F7F7F7" w:color="auto" w:val="clear"/>
+            <w:tcMar>
+              <w:top w:type="dxa" w:w="50"/>
+              <w:left w:type="dxa" w:w="80"/>
+              <w:bottom w:type="dxa" w:w="50"/>
+              <w:right w:type="dxa" w:w="80"/>
+            </w:tcMar>
+          </w:tcPr>
+          <w:p>
+            <w:pPr>
+              <w:jc w:val="center"/>
+            </w:pPr>
+            <w:r>
+              <w:rPr>
+                <w:rFonts w:ascii="Calibri" w:cs="Calibri" w:eastAsia="Calibri" w:hAnsi="Calibri"/>
+                <w:b w:val="false"/>
+                <w:bCs w:val="false"/>
+                <w:sz w:val="18"/>
+                <w:szCs w:val="18"/>
+              </w:rPr>
+              <w:t xml:space="preserve">top-3; at most 13 nodes</w:t>
+            </w:r>
+          </w:p>
+        </w:tc>
+        <w:tc>
+          <w:tcPr>
+            <w:tcW w:type="dxa" w:w="2430"/>
+            <w:tcBorders>
+              <w:top w:val="single" w:color="BFBFBF" w:sz="4"/>
+              <w:left w:val="single" w:color="BFBFBF" w:sz="4"/>
+              <w:bottom w:val="single" w:color="BFBFBF" w:sz="4"/>
+              <w:right w:val="single" w:color="BFBFBF" w:sz="4"/>
+            </w:tcBorders>
+            <w:shd w:fill="F7F7F7" w:color="auto" w:val="clear"/>
+            <w:tcMar>
+              <w:top w:type="dxa" w:w="50"/>
+              <w:left w:type="dxa" w:w="80"/>
+              <w:bottom w:type="dxa" w:w="50"/>
+              <w:right w:type="dxa" w:w="80"/>
+            </w:tcMar>
+          </w:tcPr>
+          <w:p>
+            <w:pPr>
+              <w:jc w:val="center"/>
+            </w:pPr>
+            <w:r>
+              <w:rPr>
+                <w:rFonts w:ascii="Calibri" w:cs="Calibri" w:eastAsia="Calibri" w:hAnsi="Calibri"/>
+                <w:b w:val="false"/>
+                <w:bCs w:val="false"/>
+                <w:sz w:val="18"/>
+                <w:szCs w:val="18"/>
+              </w:rPr>
+              <w:t xml:space="preserve">99.8%</w:t>
+            </w:r>
+          </w:p>
+        </w:tc>
+        <w:tc>
+          <w:tcPr>
+            <w:tcW w:type="dxa" w:w="2430"/>
+            <w:tcBorders>
+              <w:top w:val="single" w:color="BFBFBF" w:sz="4"/>
+              <w:left w:val="single" w:color="BFBFBF" w:sz="4"/>
+              <w:bottom w:val="single" w:color="BFBFBF" w:sz="4"/>
+              <w:right w:val="single" w:color="BFBFBF" w:sz="4"/>
+            </w:tcBorders>
+            <w:shd w:fill="F7F7F7" w:color="auto" w:val="clear"/>
+            <w:tcMar>
+              <w:top w:type="dxa" w:w="50"/>
+              <w:left w:type="dxa" w:w="80"/>
+              <w:bottom w:type="dxa" w:w="50"/>
+              <w:right w:type="dxa" w:w="80"/>
+            </w:tcMar>
+          </w:tcPr>
+          <w:p>
+            <w:pPr>
+              <w:jc w:val="center"/>
+            </w:pPr>
+            <w:r>
+              <w:rPr>
+                <w:rFonts w:ascii="Calibri" w:cs="Calibri" w:eastAsia="Calibri" w:hAnsi="Calibri"/>
+                <w:b w:val="false"/>
+                <w:bCs w:val="false"/>
+                <w:sz w:val="18"/>
+                <w:szCs w:val="18"/>
+              </w:rPr>
+              <w:t xml:space="preserve">98.0%</w:t>
+            </w:r>
+          </w:p>
+        </w:tc>
+      </w:tr>
+      <w:tr>
+        <w:trPr>
+          <w:cantSplit/>
+        </w:trPr>
+        <w:tc>
+          <w:tcPr>
+            <w:tcW w:type="dxa" w:w="1800"/>
+            <w:tcBorders>
+              <w:top w:val="single" w:color="BFBFBF" w:sz="4"/>
+              <w:left w:val="single" w:color="BFBFBF" w:sz="4"/>
+              <w:bottom w:val="single" w:color="BFBFBF" w:sz="4"/>
+              <w:right w:val="single" w:color="BFBFBF" w:sz="4"/>
+            </w:tcBorders>
+            <w:tcMar>
+              <w:top w:type="dxa" w:w="50"/>
+              <w:left w:type="dxa" w:w="80"/>
+              <w:bottom w:type="dxa" w:w="50"/>
+              <w:right w:type="dxa" w:w="80"/>
+            </w:tcMar>
+          </w:tcPr>
+          <w:p>
+            <w:pPr>
+              <w:jc w:val="left"/>
+            </w:pPr>
+            <w:r>
+              <w:rPr>
+                <w:rFonts w:ascii="Calibri" w:cs="Calibri" w:eastAsia="Calibri" w:hAnsi="Calibri"/>
+                <w:b w:val="false"/>
+                <w:bCs w:val="false"/>
+                <w:sz w:val="18"/>
+                <w:szCs w:val="18"/>
+              </w:rPr>
+              <w:t xml:space="preserve">Amazon Video</w:t>
+            </w:r>
+          </w:p>
+        </w:tc>
+        <w:tc>
+          <w:tcPr>
+            <w:tcW w:type="dxa" w:w="2700"/>
+            <w:tcBorders>
+              <w:top w:val="single" w:color="BFBFBF" w:sz="4"/>
+              <w:left w:val="single" w:color="BFBFBF" w:sz="4"/>
+              <w:bottom w:val="single" w:color="BFBFBF" w:sz="4"/>
+              <w:right w:val="single" w:color="BFBFBF" w:sz="4"/>
+            </w:tcBorders>
+            <w:tcMar>
+              <w:top w:type="dxa" w:w="50"/>
+              <w:left w:type="dxa" w:w="80"/>
+              <w:bottom w:type="dxa" w:w="50"/>
+              <w:right w:type="dxa" w:w="80"/>
+            </w:tcMar>
+          </w:tcPr>
+          <w:p>
+            <w:pPr>
+              <w:jc w:val="center"/>
+            </w:pPr>
+            <w:r>
+              <w:rPr>
+                <w:rFonts w:ascii="Calibri" w:cs="Calibri" w:eastAsia="Calibri" w:hAnsi="Calibri"/>
+                <w:b w:val="false"/>
+                <w:bCs w:val="false"/>
+                <w:sz w:val="18"/>
+                <w:szCs w:val="18"/>
+              </w:rPr>
+              <w:t xml:space="preserve">top-3; at most 13 nodes</w:t>
+            </w:r>
+          </w:p>
+        </w:tc>
+        <w:tc>
+          <w:tcPr>
+            <w:tcW w:type="dxa" w:w="2430"/>
+            <w:tcBorders>
+              <w:top w:val="single" w:color="BFBFBF" w:sz="4"/>
+              <w:left w:val="single" w:color="BFBFBF" w:sz="4"/>
+              <w:bottom w:val="single" w:color="BFBFBF" w:sz="4"/>
+              <w:right w:val="single" w:color="BFBFBF" w:sz="4"/>
+            </w:tcBorders>
+            <w:tcMar>
+              <w:top w:type="dxa" w:w="50"/>
+              <w:left w:type="dxa" w:w="80"/>
+              <w:bottom w:type="dxa" w:w="50"/>
+              <w:right w:type="dxa" w:w="80"/>
+            </w:tcMar>
+          </w:tcPr>
+          <w:p>
+            <w:pPr>
+              <w:jc w:val="center"/>
+            </w:pPr>
+            <w:r>
+              <w:rPr>
+                <w:rFonts w:ascii="Calibri" w:cs="Calibri" w:eastAsia="Calibri" w:hAnsi="Calibri"/>
+                <w:b w:val="false"/>
+                <w:bCs w:val="false"/>
+                <w:sz w:val="18"/>
+                <w:szCs w:val="18"/>
+              </w:rPr>
+              <w:t xml:space="preserve">96.6%</w:t>
+            </w:r>
+          </w:p>
+        </w:tc>
+        <w:tc>
+          <w:tcPr>
+            <w:tcW w:type="dxa" w:w="2430"/>
+            <w:tcBorders>
+              <w:top w:val="single" w:color="BFBFBF" w:sz="4"/>
+              <w:left w:val="single" w:color="BFBFBF" w:sz="4"/>
+              <w:bottom w:val="single" w:color="BFBFBF" w:sz="4"/>
+              <w:right w:val="single" w:color="BFBFBF" w:sz="4"/>
+            </w:tcBorders>
+            <w:tcMar>
+              <w:top w:type="dxa" w:w="50"/>
+              <w:left w:type="dxa" w:w="80"/>
+              <w:bottom w:type="dxa" w:w="50"/>
+              <w:right w:type="dxa" w:w="80"/>
+            </w:tcMar>
+          </w:tcPr>
+          <w:p>
+            <w:pPr>
+              <w:jc w:val="center"/>
+            </w:pPr>
+            <w:r>
+              <w:rPr>
+                <w:rFonts w:ascii="Calibri" w:cs="Calibri" w:eastAsia="Calibri" w:hAnsi="Calibri"/>
+                <w:b w:val="false"/>
+                <w:bCs w:val="false"/>
+                <w:sz w:val="18"/>
+                <w:szCs w:val="18"/>
+              </w:rPr>
+              <w:t xml:space="preserve">98.7–98.9%</w:t>
+            </w:r>
+          </w:p>
+        </w:tc>
+      </w:tr>
+    </w:tbl>
+    <w:p/>
+    <w:p>
+      <w:pPr>
+        <w:pStyle w:val="Heading2"/>
+        <w:spacing w:after="100" w:before="200"/>
+      </w:pPr>
+      <w:r>
+        <w:rPr>
+          <w:rFonts w:ascii="Calibri" w:cs="Calibri" w:eastAsia="Calibri" w:hAnsi="Calibri"/>
+          <w:b/>
+          <w:bCs/>
+          <w:color w:val="2F5496"/>
+          <w:sz w:val="26"/>
+          <w:szCs w:val="26"/>
+        </w:rPr>
+        <w:t xml:space="preserve">3.2 Reddit</w:t>
+      </w:r>
+    </w:p>
+    <w:p>
+      <w:pPr>
+        <w:pStyle w:val="ListParagraph"/>
+        <w:numPr>
+          <w:ilvl w:val="0"/>
+          <w:numId w:val="2"/>
+        </w:numPr>
+        <w:spacing w:after="80"/>
+      </w:pPr>
+      <w:r>
+        <w:rPr>
+          <w:rFonts w:ascii="Calibri" w:cs="Calibri" w:eastAsia="Calibri" w:hAnsi="Calibri"/>
+          <w:sz w:val="22"/>
+          <w:szCs w:val="22"/>
+        </w:rPr>
+        <w:t xml:space="preserve">Nodes are users. The graph and the text come from the GLBench release, so no text had to be added: each user’s text is the content of their last three posts, separated by semicolons. Stored node features are 4096-d vectors, which we measured to be Llama-2-derived embeddings (the paper calls them "shallow embeddings").</w:t>
+      </w:r>
+    </w:p>
+    <w:p>
+      <w:pPr>
+        <w:pStyle w:val="ListParagraph"/>
+        <w:numPr>
+          <w:ilvl w:val="0"/>
+          <w:numId w:val="2"/>
+        </w:numPr>
+        <w:spacing w:after="80"/>
+      </w:pPr>
+      <w:r>
+        <w:rPr>
+          <w:rFonts w:ascii="Calibri" w:cs="Calibri" w:eastAsia="Calibri" w:hAnsi="Calibri"/>
+          <w:sz w:val="22"/>
+          <w:szCs w:val="22"/>
+        </w:rPr>
+        <w:t xml:space="preserve">Benchmark construction: the raw graph is balanced (16,717 users per class), so the FLAG protocol is applied. All majority users are kept, the minority class is downsampled to 1,672, and the split is stratified 10/10/80. The downsampling seed is unpublished, so we used seed 0.</w:t>
+      </w:r>
+    </w:p>
+    <w:p>
+      <w:pPr>
+        <w:pStyle w:val="ListParagraph"/>
+        <w:numPr>
+          <w:ilvl w:val="0"/>
+          <w:numId w:val="2"/>
+        </w:numPr>
+        <w:spacing w:after="80"/>
+      </w:pPr>
+      <w:r>
+        <w:rPr>
+          <w:rFonts w:ascii="Calibri" w:cs="Calibri" w:eastAsia="Calibri" w:hAnsi="Calibri"/>
+          <w:sz w:val="22"/>
+          <w:szCs w:val="22"/>
+        </w:rPr>
+        <w:t xml:space="preserve">Prompts: the authors’ own prompts, extracted unchanged from the upstream code (chat.py, commit cb83944). They ask the model to write a causal line per user that helps separate "popular" from "normal" users.</w:t>
+      </w:r>
+    </w:p>
+    <w:p>
+      <w:pPr>
+        <w:pStyle w:val="ListParagraph"/>
+        <w:numPr>
+          <w:ilvl w:val="0"/>
+          <w:numId w:val="2"/>
+        </w:numPr>
+        <w:spacing w:after="80"/>
+      </w:pPr>
+      <w:r>
+        <w:rPr>
+          <w:rFonts w:ascii="Calibri" w:cs="Calibri" w:eastAsia="Calibri" w:hAnsi="Calibri"/>
+          <w:sz w:val="22"/>
+          <w:szCs w:val="22"/>
+        </w:rPr>
+        <w:t xml:space="preserve">LLM text: 55.5% of nodes got discriminative text and 72.5% residual text. About 1.2% of prompts exceeded Gemma-2’s 8,192-token context and counted as format failures.</w:t>
+      </w:r>
+    </w:p>
+    <w:p>
+      <w:pPr>
+        <w:pStyle w:val="ListParagraph"/>
+        <w:numPr>
+          <w:ilvl w:val="0"/>
+          <w:numId w:val="2"/>
+        </w:numPr>
+        <w:spacing w:after="80"/>
+      </w:pPr>
+      <w:r>
+        <w:rPr>
+          <w:rFonts w:ascii="Calibri" w:cs="Calibri" w:eastAsia="Calibri" w:hAnsi="Calibri"/>
+          <w:sz w:val="22"/>
+          <w:szCs w:val="22"/>
+        </w:rPr>
+        <w:t xml:space="preserve">Comparison: the paper reports Reddit results, so this is the one dataset where the full FLAG pipeline can be compared with published numbers.</w:t>
+      </w:r>
+    </w:p>
+    <w:p>
+      <w:pPr>
+        <w:pStyle w:val="Heading2"/>
+        <w:spacing w:after="100" w:before="200"/>
+      </w:pPr>
+      <w:r>
+        <w:rPr>
+          <w:rFonts w:ascii="Calibri" w:cs="Calibri" w:eastAsia="Calibri" w:hAnsi="Calibri"/>
+          <w:b/>
+          <w:bCs/>
+          <w:color w:val="2F5496"/>
+          <w:sz w:val="26"/>
+          <w:szCs w:val="26"/>
+        </w:rPr>
+        <w:t xml:space="preserve">3.3 Instagram</w:t>
+      </w:r>
+    </w:p>
+    <w:p>
+      <w:pPr>
+        <w:pStyle w:val="ListParagraph"/>
+        <w:numPr>
+          <w:ilvl w:val="0"/>
+          <w:numId w:val="2"/>
+        </w:numPr>
+        <w:spacing w:after="80"/>
+      </w:pPr>
+      <w:r>
+        <w:rPr>
+          <w:rFonts w:ascii="Calibri" w:cs="Calibri" w:eastAsia="Calibri" w:hAnsi="Calibri"/>
+          <w:sz w:val="22"/>
+          <w:szCs w:val="22"/>
+        </w:rPr>
+        <w:t xml:space="preserve">Nodes are users. Text is the user’s profile bio, which comes with the GLBench release. Features are the same kind of 4096-d stored vectors as Reddit.</w:t>
+      </w:r>
+    </w:p>
+    <w:p>
+      <w:pPr>
+        <w:pStyle w:val="ListParagraph"/>
+        <w:numPr>
+          <w:ilvl w:val="0"/>
+          <w:numId w:val="2"/>
+        </w:numPr>
+        <w:spacing w:after="80"/>
+      </w:pPr>
+      <w:r>
+        <w:rPr>
+          <w:rFonts w:ascii="Calibri" w:cs="Calibri" w:eastAsia="Calibri" w:hAnsi="Calibri"/>
+          <w:sz w:val="22"/>
+          <w:szCs w:val="22"/>
+        </w:rPr>
+        <w:t xml:space="preserve">Benchmark construction: the raw graph has 4,115 minority and 7,224 majority users. The minority class is downsampled to 722 for a 1:10 ratio, with the same 10/10/80 split and seed 0.</w:t>
+      </w:r>
+    </w:p>
+    <w:p>
+      <w:pPr>
+        <w:pStyle w:val="ListParagraph"/>
+        <w:numPr>
+          <w:ilvl w:val="0"/>
+          <w:numId w:val="2"/>
+        </w:numPr>
+        <w:spacing w:after="80"/>
+      </w:pPr>
+      <w:r>
+        <w:rPr>
+          <w:rFonts w:ascii="Calibri" w:cs="Calibri" w:eastAsia="Calibri" w:hAnsi="Calibri"/>
+          <w:sz w:val="22"/>
+          <w:szCs w:val="22"/>
+        </w:rPr>
+        <w:t xml:space="preserve">Prompts: the authors’ own Instagram prompts (chat1.py), unchanged.</w:t>
+      </w:r>
+    </w:p>
+    <w:p>
+      <w:pPr>
+        <w:pStyle w:val="ListParagraph"/>
+        <w:numPr>
+          <w:ilvl w:val="0"/>
+          <w:numId w:val="2"/>
+        </w:numPr>
+        <w:spacing w:after="80"/>
+      </w:pPr>
+      <w:r>
+        <w:rPr>
+          <w:rFonts w:ascii="Calibri" w:cs="Calibri" w:eastAsia="Calibri" w:hAnsi="Calibri"/>
+          <w:sz w:val="22"/>
+          <w:szCs w:val="22"/>
+        </w:rPr>
+        <w:t xml:space="preserve">LLM text: only 9.1% of nodes (discriminative) and 20.7% (residual) got LLM text. Instagram subgraphs are large (median 35 nodes), most cannot yield one line per node within 550 tokens, and only 42–54% of subgraphs pass the format check. Instagram "flag" therefore mostly runs on raw text, which is why FLAG is slightly worse than raw text there (−0.92 AUC).</w:t>
+      </w:r>
+    </w:p>
+    <w:p>
+      <w:pPr>
+        <w:pStyle w:val="Heading2"/>
+        <w:spacing w:after="100" w:before="200"/>
+      </w:pPr>
+      <w:r>
+        <w:rPr>
+          <w:rFonts w:ascii="Calibri" w:cs="Calibri" w:eastAsia="Calibri" w:hAnsi="Calibri"/>
+          <w:b/>
+          <w:bCs/>
+          <w:color w:val="2F5496"/>
+          <w:sz w:val="26"/>
+          <w:szCs w:val="26"/>
+        </w:rPr>
+        <w:t xml:space="preserve">3.4 Amazon</w:t>
+      </w:r>
+    </w:p>
+    <w:p>
+      <w:pPr>
+        <w:pStyle w:val="ListParagraph"/>
+        <w:numPr>
+          <w:ilvl w:val="0"/>
+          <w:numId w:val="2"/>
+        </w:numPr>
+        <w:spacing w:after="80"/>
+      </w:pPr>
+      <w:r>
+        <w:rPr>
+          <w:rFonts w:ascii="Calibri" w:cs="Calibri" w:eastAsia="Calibri" w:hAnsi="Calibri"/>
+          <w:sz w:val="22"/>
+          <w:szCs w:val="22"/>
+        </w:rPr>
+        <w:t xml:space="preserve">Nodes are users (11,944). The graph is the CARE-GNN Amazon.mat release (Musical Instruments), with three relations (U-P-U: users who reviewed a common product; U-S-U: same star rating within a week; U-V-U: similar review text) and 25 engineered fraud features. The dataset has no text of its own, and the FLAG paper says so.</w:t>
+      </w:r>
+    </w:p>
+    <w:p>
+      <w:pPr>
+        <w:pStyle w:val="ListParagraph"/>
+        <w:numPr>
+          <w:ilvl w:val="0"/>
+          <w:numId w:val="2"/>
+        </w:numPr>
+        <w:spacing w:after="80"/>
+      </w:pPr>
+      <w:r>
+        <w:rPr>
+          <w:rFonts w:ascii="Calibri" w:cs="Calibri" w:eastAsia="Calibri" w:hAnsi="Calibri"/>
+          <w:sz w:val="22"/>
+          <w:szCs w:val="22"/>
+        </w:rPr>
+        <w:t xml:space="preserve">Where the text came from: the McAuley 2014 Musical Instruments review dump (500,176 reviews, 339,231 reviewers). The 5-core versions of 2014 and 2018 were tested and ruled out because they contain far too few reviewers. Each user’s text is all of their reviews written out as "Review k: Rating, Date, Product, Summary, Text", in corpus order, with nothing cut in the stored version. The median text is 1,809 characters.</w:t>
+      </w:r>
+    </w:p>
+    <w:p>
+      <w:pPr>
+        <w:pStyle w:val="ListParagraph"/>
+        <w:numPr>
+          <w:ilvl w:val="0"/>
+          <w:numId w:val="2"/>
+        </w:numPr>
+        <w:spacing w:after="80"/>
+      </w:pPr>
+      <w:r>
+        <w:rPr>
+          <w:rFonts w:ascii="Calibri" w:cs="Calibri" w:eastAsia="Calibri" w:hAnsi="Calibri"/>
+          <w:sz w:val="22"/>
+          <w:szCs w:val="22"/>
+        </w:rPr>
+        <w:t xml:space="preserve">How text was matched to nodes: the 8,639 labelled users follow reviewer first-appearance order in the dump. This was proven twice: the label sequence matches 8,639 of 8,639, and rebuilding the U-P-U edges from the reviews reproduces the graph exactly (294,764 edges, 0 mismatches).</w:t>
+      </w:r>
+    </w:p>
+    <w:p>
+      <w:pPr>
+        <w:pStyle w:val="ListParagraph"/>
+        <w:numPr>
+          <w:ilvl w:val="0"/>
+          <w:numId w:val="2"/>
+        </w:numPr>
+        <w:spacing w:after="80"/>
+      </w:pPr>
+      <w:r>
+        <w:rPr>
+          <w:rFonts w:ascii="Calibri" w:cs="Calibri" w:eastAsia="Calibri" w:hAnsi="Calibri"/>
+          <w:sz w:val="22"/>
+          <w:szCs w:val="22"/>
+        </w:rPr>
+        <w:t xml:space="preserve">What could not be matched: the other 3,305 users are context nodes sampled in an order that cannot be reproduced. They keep empty text and are excluded from every split, so no evaluated node lacks text.</w:t>
+      </w:r>
+    </w:p>
+    <w:p>
+      <w:pPr>
+        <w:pStyle w:val="ListParagraph"/>
+        <w:numPr>
+          <w:ilvl w:val="0"/>
+          <w:numId w:val="2"/>
+        </w:numPr>
+        <w:spacing w:after="80"/>
+      </w:pPr>
+      <w:r>
+        <w:rPr>
+          <w:rFonts w:ascii="Calibri" w:cs="Calibri" w:eastAsia="Calibri" w:hAnsi="Calibri"/>
+          <w:sz w:val="22"/>
+          <w:szCs w:val="22"/>
+        </w:rPr>
+        <w:t xml:space="preserve">Labels and split: users with at least 20 helpful-vote ratings are labelled benign if more than 80% helpful and fraud if less than 20% (CARE-GNN’s rule). There is no downsampling; the natural fraud rate is 9.5% of labelled users. The split follows CARE-GNN (30/10/60 train/val/test).</w:t>
+      </w:r>
+    </w:p>
+    <w:p>
+      <w:pPr>
+        <w:pStyle w:val="ListParagraph"/>
+        <w:numPr>
+          <w:ilvl w:val="0"/>
+          <w:numId w:val="2"/>
+        </w:numPr>
+        <w:spacing w:after="80"/>
+      </w:pPr>
+      <w:r>
+        <w:rPr>
+          <w:rFonts w:ascii="Calibri" w:cs="Calibri" w:eastAsia="Calibri" w:hAnsi="Calibri"/>
+          <w:sz w:val="22"/>
+          <w:szCs w:val="22"/>
+        </w:rPr>
+        <w:t xml:space="preserve">Prompts: written by us, because upstream has none. They copy the Reddit prompt structure and change the classes to fraudulent and benign. The sampler uses top-3 neighbours because Amazon is very dense (average degree 736), and the baseline uses random top-3 neighbours of the same size.</w:t>
+      </w:r>
+    </w:p>
+    <w:p>
+      <w:pPr>
+        <w:pStyle w:val="ListParagraph"/>
+        <w:numPr>
+          <w:ilvl w:val="0"/>
+          <w:numId w:val="2"/>
+        </w:numPr>
+        <w:spacing w:after="80"/>
+      </w:pPr>
+      <w:r>
+        <w:rPr>
+          <w:rFonts w:ascii="Calibri" w:cs="Calibri" w:eastAsia="Calibri" w:hAnsi="Calibri"/>
+          <w:sz w:val="22"/>
+          <w:szCs w:val="22"/>
+        </w:rPr>
+        <w:t xml:space="preserve">LLM text: 97.5% discriminative and 99.1% residual coverage.</w:t>
+      </w:r>
+    </w:p>
+    <w:p>
+      <w:pPr>
+        <w:pStyle w:val="Heading2"/>
+        <w:spacing w:after="100" w:before="200"/>
+      </w:pPr>
+      <w:r>
+        <w:rPr>
+          <w:rFonts w:ascii="Calibri" w:cs="Calibri" w:eastAsia="Calibri" w:hAnsi="Calibri"/>
+          <w:b/>
+          <w:bCs/>
+          <w:color w:val="2F5496"/>
+          <w:sz w:val="26"/>
+          <w:szCs w:val="26"/>
+        </w:rPr>
+        <w:t xml:space="preserve">3.5 YelpChi</w:t>
+      </w:r>
+    </w:p>
+    <w:p>
+      <w:pPr>
+        <w:pStyle w:val="ListParagraph"/>
+        <w:numPr>
+          <w:ilvl w:val="0"/>
+          <w:numId w:val="2"/>
+        </w:numPr>
+        <w:spacing w:after="80"/>
+      </w:pPr>
+      <w:r>
+        <w:rPr>
+          <w:rFonts w:ascii="Calibri" w:cs="Calibri" w:eastAsia="Calibri" w:hAnsi="Calibri"/>
+          <w:sz w:val="22"/>
+          <w:szCs w:val="22"/>
+        </w:rPr>
+        <w:t xml:space="preserve">Nodes are reviews (45,954), so the text is one-to-one: node i gets the text of its own review, with no aggregation or truncation. The graph is the CARE-GNN YelpChi.mat release with 32 engineered features and three relations (R-U-R: same user; R-S-R: same product and star rating; R-T-R: same product and month).</w:t>
+      </w:r>
+    </w:p>
+    <w:p>
+      <w:pPr>
+        <w:pStyle w:val="ListParagraph"/>
+        <w:numPr>
+          <w:ilvl w:val="0"/>
+          <w:numId w:val="2"/>
+        </w:numPr>
+        <w:spacing w:after="80"/>
+      </w:pPr>
+      <w:r>
+        <w:rPr>
+          <w:rFonts w:ascii="Calibri" w:cs="Calibri" w:eastAsia="Calibri" w:hAnsi="Calibri"/>
+          <w:sz w:val="22"/>
+          <w:szCs w:val="22"/>
+        </w:rPr>
+        <w:t xml:space="preserve">Where the text came from: the Mukherjee et al. (ICWSM 2013) corpus via a public mirror, with a hotel file (5,854 reviews) and a restaurant file (61,541 reviews), 67,395 in total. The 45,954-node graph is a subset of it, with products having more than 800 reviews dropped.</w:t>
+      </w:r>
+    </w:p>
+    <w:p>
+      <w:pPr>
+        <w:pStyle w:val="ListParagraph"/>
+        <w:numPr>
+          <w:ilvl w:val="0"/>
+          <w:numId w:val="2"/>
+        </w:numPr>
+        <w:spacing w:after="80"/>
+      </w:pPr>
+      <w:r>
+        <w:rPr>
+          <w:rFonts w:ascii="Calibri" w:cs="Calibri" w:eastAsia="Calibri" w:hAnsi="Calibri"/>
+          <w:sz w:val="22"/>
+          <w:szCs w:val="22"/>
+        </w:rPr>
+        <w:t xml:space="preserve">How text was matched to nodes: the node order was proven by rebuilding the R-U-R and R-S-R relations from the raw metadata (98,630 and 6,805,486 edges, 0 mismatches) and matching all 45,954 labels. The join of the text itself to those rows is positional and only statistically supported: TF-IDF cosine between reviews of the same product is 0.0747, against 0.0433 for the baseline. If the join were wrong, text effects on YelpChi would be underestimated.</w:t>
+      </w:r>
+    </w:p>
+    <w:p>
+      <w:pPr>
+        <w:pStyle w:val="ListParagraph"/>
+        <w:numPr>
+          <w:ilvl w:val="0"/>
+          <w:numId w:val="2"/>
+        </w:numPr>
+        <w:spacing w:after="80"/>
+      </w:pPr>
+      <w:r>
+        <w:rPr>
+          <w:rFonts w:ascii="Calibri" w:cs="Calibri" w:eastAsia="Calibri" w:hAnsi="Calibri"/>
+          <w:sz w:val="22"/>
+          <w:szCs w:val="22"/>
+        </w:rPr>
+        <w:t xml:space="preserve">One known gap: the R-T-R relation cannot be reproduced because the date snapshot differs.</w:t>
+      </w:r>
+    </w:p>
+    <w:p>
+      <w:pPr>
+        <w:pStyle w:val="ListParagraph"/>
+        <w:numPr>
+          <w:ilvl w:val="0"/>
+          <w:numId w:val="2"/>
+        </w:numPr>
+        <w:spacing w:after="80"/>
+      </w:pPr>
+      <w:r>
+        <w:rPr>
+          <w:rFonts w:ascii="Calibri" w:cs="Calibri" w:eastAsia="Calibri" w:hAnsi="Calibri"/>
+          <w:sz w:val="22"/>
+          <w:szCs w:val="22"/>
+        </w:rPr>
+        <w:t xml:space="preserve">Labels and split: the natural fraud rate (14.5%) is kept, with no downsampling, and the split is 30/10/60. Prompts are ours, written for reviews ("fraudulent or legitimate") on top of the Reddit structure. Sampling uses top-3 (average degree 167).</w:t>
+      </w:r>
+    </w:p>
+    <w:p>
+      <w:pPr>
+        <w:pStyle w:val="ListParagraph"/>
+        <w:numPr>
+          <w:ilvl w:val="0"/>
+          <w:numId w:val="2"/>
+        </w:numPr>
+        <w:spacing w:after="80"/>
+      </w:pPr>
+      <w:r>
+        <w:rPr>
+          <w:rFonts w:ascii="Calibri" w:cs="Calibri" w:eastAsia="Calibri" w:hAnsi="Calibri"/>
+          <w:sz w:val="22"/>
+          <w:szCs w:val="22"/>
+        </w:rPr>
+        <w:t xml:space="preserve">LLM text: 99.8% discriminative and 98.0% residual coverage.</w:t>
+      </w:r>
+    </w:p>
+    <w:p>
+      <w:pPr>
+        <w:pStyle w:val="Heading2"/>
+        <w:spacing w:after="100" w:before="200"/>
+      </w:pPr>
+      <w:r>
+        <w:rPr>
+          <w:rFonts w:ascii="Calibri" w:cs="Calibri" w:eastAsia="Calibri" w:hAnsi="Calibri"/>
+          <w:b/>
+          <w:bCs/>
+          <w:color w:val="2F5496"/>
+          <w:sz w:val="26"/>
+          <w:szCs w:val="26"/>
+        </w:rPr>
+        <w:t xml:space="preserve">3.6 Amazon Video</w:t>
+      </w:r>
+    </w:p>
+    <w:p>
+      <w:pPr>
+        <w:pStyle w:val="ListParagraph"/>
+        <w:numPr>
+          <w:ilvl w:val="0"/>
+          <w:numId w:val="2"/>
+        </w:numPr>
+        <w:spacing w:after="80"/>
+      </w:pPr>
+      <w:r>
+        <w:rPr>
+          <w:rFonts w:ascii="Calibri" w:cs="Calibri" w:eastAsia="Calibri" w:hAnsi="Calibri"/>
+          <w:sz w:val="22"/>
+          <w:szCs w:val="22"/>
+        </w:rPr>
+        <w:t xml:space="preserve">This graph does not exist in the literature; we built it, following the CARE-GNN Amazon recipe, from the McAuley 2014 Amazon Instant Video review dump.</w:t>
+      </w:r>
+    </w:p>
+    <w:p>
+      <w:pPr>
+        <w:pStyle w:val="ListParagraph"/>
+        <w:numPr>
+          <w:ilvl w:val="0"/>
+          <w:numId w:val="2"/>
+        </w:numPr>
+        <w:spacing w:after="80"/>
+      </w:pPr>
+      <w:r>
+        <w:rPr>
+          <w:rFonts w:ascii="Calibri" w:cs="Calibri" w:eastAsia="Calibri" w:hAnsi="Calibri"/>
+          <w:sz w:val="22"/>
+          <w:szCs w:val="22"/>
+        </w:rPr>
+        <w:t xml:space="preserve">Nodes: users are reviewers in first-appearance order. Two users are linked if they reviewed a common product (user–product–user, the only relation CARE-GNN implemented). Labels use the same helpful-vote rule as Amazon. The raw labelled set is 40% fraud, so the labelled set is downsampled to 1:10 with a seeded sampler. This is our addition, matching the Reddit and Instagram protocol.</w:t>
+      </w:r>
+    </w:p>
+    <w:p>
+      <w:pPr>
+        <w:pStyle w:val="ListParagraph"/>
+        <w:numPr>
+          <w:ilvl w:val="0"/>
+          <w:numId w:val="2"/>
+        </w:numPr>
+        <w:spacing w:after="80"/>
+      </w:pPr>
+      <w:r>
+        <w:rPr>
+          <w:rFonts w:ascii="Calibri" w:cs="Calibri" w:eastAsia="Calibri" w:hAnsi="Calibri"/>
+          <w:sz w:val="22"/>
+          <w:szCs w:val="22"/>
+        </w:rPr>
+        <w:t xml:space="preserve">Result: 6,241 nodes, of which 1,821 are benign, 182 fraud and 4,238 unlabelled context nodes kept for the graph only; 208,832 edges. Features come from CARE-GNN’s own feature builder with its "polluted" helpful-vote columns removed, leaving 25 columns. The split follows the CARE-GNN convention (30/10/60).</w:t>
+      </w:r>
+    </w:p>
+    <w:p>
+      <w:pPr>
+        <w:pStyle w:val="ListParagraph"/>
+        <w:numPr>
+          <w:ilvl w:val="0"/>
+          <w:numId w:val="2"/>
+        </w:numPr>
+        <w:spacing w:after="80"/>
+      </w:pPr>
+      <w:r>
+        <w:rPr>
+          <w:rFonts w:ascii="Calibri" w:cs="Calibri" w:eastAsia="Calibri" w:hAnsi="Calibri"/>
+          <w:sz w:val="22"/>
+          <w:szCs w:val="22"/>
+        </w:rPr>
+        <w:t xml:space="preserve">Text: each user’s reviews are written out with the same serializer as Amazon, so every node has text. Prompts are the Amazon prompts, copied unchanged. Sampling uses top-3.</w:t>
+      </w:r>
+    </w:p>
+    <w:p>
+      <w:pPr>
+        <w:pStyle w:val="ListParagraph"/>
+        <w:numPr>
+          <w:ilvl w:val="0"/>
+          <w:numId w:val="2"/>
+        </w:numPr>
+        <w:spacing w:after="80"/>
+      </w:pPr>
+      <w:r>
+        <w:rPr>
+          <w:rFonts w:ascii="Calibri" w:cs="Calibri" w:eastAsia="Calibri" w:hAnsi="Calibri"/>
+          <w:sz w:val="22"/>
+          <w:szCs w:val="22"/>
+        </w:rPr>
+        <w:t xml:space="preserve">LLM text: 96.6% discriminative and 98.7–98.9% residual coverage. No raw-text-only control was run on this dataset, so FLAG’s LLM effect cannot be separated from text here.</w:t>
+      </w:r>
+    </w:p>
+    <w:p>
+      <w:pPr>
+        <w:pStyle w:val="ListParagraph"/>
+        <w:numPr>
+          <w:ilvl w:val="0"/>
+          <w:numId w:val="2"/>
+        </w:numPr>
+        <w:spacing w:after="80"/>
+      </w:pPr>
+      <w:r>
+        <w:rPr>
+          <w:rFonts w:ascii="Calibri" w:cs="Calibri" w:eastAsia="Calibri" w:hAnsi="Calibri"/>
+          <w:sz w:val="22"/>
+          <w:szCs w:val="22"/>
+        </w:rPr>
+        <w:t xml:space="preserve">With only 109 test fraud nodes, Amazon Video is the noisiest dataset.</w:t>
+      </w:r>
+    </w:p>
+    <w:p>
+      <w:pPr>
+        <w:pStyle w:val="Heading2"/>
+        <w:spacing w:after="100" w:before="200"/>
+      </w:pPr>
+      <w:r>
+        <w:rPr>
+          <w:rFonts w:ascii="Calibri" w:cs="Calibri" w:eastAsia="Calibri" w:hAnsi="Calibri"/>
+          <w:b/>
+          <w:bCs/>
+          <w:color w:val="2F5496"/>
+          <w:sz w:val="26"/>
+          <w:szCs w:val="26"/>
+        </w:rPr>
+        <w:t xml:space="preserve">3.7 Side by side</w:t>
+      </w:r>
+    </w:p>
+    <w:p>
+      <w:pPr>
+        <w:keepNext/>
+        <w:spacing w:after="80" w:before="160"/>
+      </w:pPr>
+      <w:r>
+        <w:rPr>
+          <w:rFonts w:ascii="Calibri" w:cs="Calibri" w:eastAsia="Calibri" w:hAnsi="Calibri"/>
+          <w:i/>
+          <w:iCs/>
+          <w:color w:val="444444"/>
+          <w:sz w:val="20"/>
+          <w:szCs w:val="20"/>
+        </w:rPr>
+        <w:t xml:space="preserve">Table 3b. Where each dataset’s text and prompts come from.</w:t>
+      </w:r>
+    </w:p>
+    <w:tbl>
+      <w:tblPr>
+        <w:tblW w:type="dxa" w:w="9360"/>
+        <w:tblBorders>
+          <w:top w:val="single" w:color="auto" w:sz="4"/>
+          <w:left w:val="single" w:color="auto" w:sz="4"/>
+          <w:bottom w:val="single" w:color="auto" w:sz="4"/>
+          <w:right w:val="single" w:color="auto" w:sz="4"/>
+          <w:insideH w:val="single" w:color="auto" w:sz="4"/>
+          <w:insideV w:val="single" w:color="auto" w:sz="4"/>
+        </w:tblBorders>
+      </w:tblPr>
+      <w:tblGrid>
+        <w:gridCol w:w="1500"/>
+        <w:gridCol w:w="2700"/>
+        <w:gridCol w:w="1600"/>
+        <w:gridCol w:w="2000"/>
+        <w:gridCol w:w="1560"/>
+      </w:tblGrid>
+      <w:tr>
+        <w:trPr>
+          <w:tblHeader/>
+        </w:trPr>
+        <w:tc>
+          <w:tcPr>
+            <w:tcW w:type="dxa" w:w="1500"/>
+            <w:tcBorders>
+              <w:top w:val="single" w:color="BFBFBF" w:sz="4"/>
+              <w:left w:val="single" w:color="BFBFBF" w:sz="4"/>
+              <w:bottom w:val="single" w:color="BFBFBF" w:sz="4"/>
+              <w:right w:val="single" w:color="BFBFBF" w:sz="4"/>
+            </w:tcBorders>
+            <w:shd w:fill="1F3864" w:color="auto" w:val="clear"/>
+            <w:tcMar>
+              <w:top w:type="dxa" w:w="50"/>
+              <w:left w:type="dxa" w:w="80"/>
+              <w:bottom w:type="dxa" w:w="50"/>
+              <w:right w:type="dxa" w:w="80"/>
+            </w:tcMar>
+          </w:tcPr>
+          <w:p>
+            <w:pPr>
+              <w:jc w:val="left"/>
+            </w:pPr>
+            <w:r>
+              <w:rPr>
+                <w:rFonts w:ascii="Calibri" w:cs="Calibri" w:eastAsia="Calibri" w:hAnsi="Calibri"/>
+                <w:b/>
+                <w:bCs/>
+                <w:color w:val="FFFFFF"/>
+                <w:sz w:val="17"/>
+                <w:szCs w:val="17"/>
+              </w:rPr>
+              <w:t xml:space="preserve">Dataset</w:t>
+            </w:r>
+          </w:p>
+        </w:tc>
+        <w:tc>
+          <w:tcPr>
+            <w:tcW w:type="dxa" w:w="2700"/>
+            <w:tcBorders>
+              <w:top w:val="single" w:color="BFBFBF" w:sz="4"/>
+              <w:left w:val="single" w:color="BFBFBF" w:sz="4"/>
+              <w:bottom w:val="single" w:color="BFBFBF" w:sz="4"/>
+              <w:right w:val="single" w:color="BFBFBF" w:sz="4"/>
+            </w:tcBorders>
+            <w:shd w:fill="1F3864" w:color="auto" w:val="clear"/>
+            <w:tcMar>
+              <w:top w:type="dxa" w:w="50"/>
+              <w:left w:type="dxa" w:w="80"/>
+              <w:bottom w:type="dxa" w:w="50"/>
+              <w:right w:type="dxa" w:w="80"/>
+            </w:tcMar>
+          </w:tcPr>
+          <w:p>
+            <w:pPr>
+              <w:jc w:val="center"/>
+            </w:pPr>
+            <w:r>
+              <w:rPr>
+                <w:rFonts w:ascii="Calibri" w:cs="Calibri" w:eastAsia="Calibri" w:hAnsi="Calibri"/>
+                <w:b/>
+                <w:bCs/>
+                <w:color w:val="FFFFFF"/>
+                <w:sz w:val="17"/>
+                <w:szCs w:val="17"/>
+              </w:rPr>
+              <w:t xml:space="preserve">Raw text</w:t>
+            </w:r>
+          </w:p>
+        </w:tc>
+        <w:tc>
+          <w:tcPr>
+            <w:tcW w:type="dxa" w:w="1600"/>
+            <w:tcBorders>
+              <w:top w:val="single" w:color="BFBFBF" w:sz="4"/>
+              <w:left w:val="single" w:color="BFBFBF" w:sz="4"/>
+              <w:bottom w:val="single" w:color="BFBFBF" w:sz="4"/>
+              <w:right w:val="single" w:color="BFBFBF" w:sz="4"/>
+            </w:tcBorders>
+            <w:shd w:fill="1F3864" w:color="auto" w:val="clear"/>
+            <w:tcMar>
+              <w:top w:type="dxa" w:w="50"/>
+              <w:left w:type="dxa" w:w="80"/>
+              <w:bottom w:type="dxa" w:w="50"/>
+              <w:right w:type="dxa" w:w="80"/>
+            </w:tcMar>
+          </w:tcPr>
+          <w:p>
+            <w:pPr>
+              <w:jc w:val="center"/>
+            </w:pPr>
+            <w:r>
+              <w:rPr>
+                <w:rFonts w:ascii="Calibri" w:cs="Calibri" w:eastAsia="Calibri" w:hAnsi="Calibri"/>
+                <w:b/>
+                <w:bCs/>
+                <w:color w:val="FFFFFF"/>
+                <w:sz w:val="17"/>
+                <w:szCs w:val="17"/>
+              </w:rPr>
+              <w:t xml:space="preserve">Node = </w:t>
+            </w:r>
+          </w:p>
+        </w:tc>
+        <w:tc>
+          <w:tcPr>
+            <w:tcW w:type="dxa" w:w="2000"/>
+            <w:tcBorders>
+              <w:top w:val="single" w:color="BFBFBF" w:sz="4"/>
+              <w:left w:val="single" w:color="BFBFBF" w:sz="4"/>
+              <w:bottom w:val="single" w:color="BFBFBF" w:sz="4"/>
+              <w:right w:val="single" w:color="BFBFBF" w:sz="4"/>
+            </w:tcBorders>
+            <w:shd w:fill="1F3864" w:color="auto" w:val="clear"/>
+            <w:tcMar>
+              <w:top w:type="dxa" w:w="50"/>
+              <w:left w:type="dxa" w:w="80"/>
+              <w:bottom w:type="dxa" w:w="50"/>
+              <w:right w:type="dxa" w:w="80"/>
+            </w:tcMar>
+          </w:tcPr>
+          <w:p>
+            <w:pPr>
+              <w:jc w:val="center"/>
+            </w:pPr>
+            <w:r>
+              <w:rPr>
+                <w:rFonts w:ascii="Calibri" w:cs="Calibri" w:eastAsia="Calibri" w:hAnsi="Calibri"/>
+                <w:b/>
+                <w:bCs/>
+                <w:color w:val="FFFFFF"/>
+                <w:sz w:val="17"/>
+                <w:szCs w:val="17"/>
+              </w:rPr>
+              <w:t xml:space="preserve">Prompts</w:t>
+            </w:r>
+          </w:p>
+        </w:tc>
+        <w:tc>
+          <w:tcPr>
+            <w:tcW w:type="dxa" w:w="1560"/>
+            <w:tcBorders>
+              <w:top w:val="single" w:color="BFBFBF" w:sz="4"/>
+              <w:left w:val="single" w:color="BFBFBF" w:sz="4"/>
+              <w:bottom w:val="single" w:color="BFBFBF" w:sz="4"/>
+              <w:right w:val="single" w:color="BFBFBF" w:sz="4"/>
+            </w:tcBorders>
+            <w:shd w:fill="1F3864" w:color="auto" w:val="clear"/>
+            <w:tcMar>
+              <w:top w:type="dxa" w:w="50"/>
+              <w:left w:type="dxa" w:w="80"/>
+              <w:bottom w:type="dxa" w:w="50"/>
+              <w:right w:type="dxa" w:w="80"/>
+            </w:tcMar>
+          </w:tcPr>
+          <w:p>
+            <w:pPr>
+              <w:jc w:val="center"/>
+            </w:pPr>
+            <w:r>
+              <w:rPr>
+                <w:rFonts w:ascii="Calibri" w:cs="Calibri" w:eastAsia="Calibri" w:hAnsi="Calibri"/>
+                <w:b/>
+                <w:bCs/>
+                <w:color w:val="FFFFFF"/>
+                <w:sz w:val="17"/>
+                <w:szCs w:val="17"/>
+              </w:rPr>
+              <w:t xml:space="preserve">Paper results exist</w:t>
+            </w:r>
+          </w:p>
+        </w:tc>
+      </w:tr>
+      <w:tr>
+        <w:trPr>
+          <w:cantSplit/>
+        </w:trPr>
+        <w:tc>
+          <w:tcPr>
+            <w:tcW w:type="dxa" w:w="1500"/>
+            <w:tcBorders>
+              <w:top w:val="single" w:color="BFBFBF" w:sz="4"/>
+              <w:left w:val="single" w:color="BFBFBF" w:sz="4"/>
+              <w:bottom w:val="single" w:color="BFBFBF" w:sz="4"/>
+              <w:right w:val="single" w:color="BFBFBF" w:sz="4"/>
+            </w:tcBorders>
+            <w:tcMar>
+              <w:top w:type="dxa" w:w="50"/>
+              <w:left w:type="dxa" w:w="80"/>
+              <w:bottom w:type="dxa" w:w="50"/>
+              <w:right w:type="dxa" w:w="80"/>
+            </w:tcMar>
+          </w:tcPr>
+          <w:p>
+            <w:pPr>
+              <w:jc w:val="left"/>
+            </w:pPr>
+            <w:r>
+              <w:rPr>
+                <w:rFonts w:ascii="Calibri" w:cs="Calibri" w:eastAsia="Calibri" w:hAnsi="Calibri"/>
+                <w:b w:val="false"/>
+                <w:bCs w:val="false"/>
+                <w:sz w:val="17"/>
+                <w:szCs w:val="17"/>
+              </w:rPr>
+              <w:t xml:space="preserve">Reddit</w:t>
+            </w:r>
+          </w:p>
+        </w:tc>
+        <w:tc>
+          <w:tcPr>
+            <w:tcW w:type="dxa" w:w="2700"/>
+            <w:tcBorders>
+              <w:top w:val="single" w:color="BFBFBF" w:sz="4"/>
+              <w:left w:val="single" w:color="BFBFBF" w:sz="4"/>
+              <w:bottom w:val="single" w:color="BFBFBF" w:sz="4"/>
+              <w:right w:val="single" w:color="BFBFBF" w:sz="4"/>
+            </w:tcBorders>
+            <w:tcMar>
+              <w:top w:type="dxa" w:w="50"/>
+              <w:left w:type="dxa" w:w="80"/>
+              <w:bottom w:type="dxa" w:w="50"/>
+              <w:right w:type="dxa" w:w="80"/>
+            </w:tcMar>
+          </w:tcPr>
+          <w:p>
+            <w:pPr>
+              <w:jc w:val="center"/>
+            </w:pPr>
+            <w:r>
+              <w:rPr>
+                <w:rFonts w:ascii="Calibri" w:cs="Calibri" w:eastAsia="Calibri" w:hAnsi="Calibri"/>
+                <w:b w:val="false"/>
+                <w:bCs w:val="false"/>
+                <w:sz w:val="17"/>
+                <w:szCs w:val="17"/>
+              </w:rPr>
+              <w:t xml:space="preserve">Native (last 3 posts)</w:t>
+            </w:r>
+          </w:p>
+        </w:tc>
+        <w:tc>
+          <w:tcPr>
+            <w:tcW w:type="dxa" w:w="1600"/>
+            <w:tcBorders>
+              <w:top w:val="single" w:color="BFBFBF" w:sz="4"/>
+              <w:left w:val="single" w:color="BFBFBF" w:sz="4"/>
+              <w:bottom w:val="single" w:color="BFBFBF" w:sz="4"/>
+              <w:right w:val="single" w:color="BFBFBF" w:sz="4"/>
+            </w:tcBorders>
+            <w:tcMar>
+              <w:top w:type="dxa" w:w="50"/>
+              <w:left w:type="dxa" w:w="80"/>
+              <w:bottom w:type="dxa" w:w="50"/>
+              <w:right w:type="dxa" w:w="80"/>
+            </w:tcMar>
+          </w:tcPr>
+          <w:p>
+            <w:pPr>
+              <w:jc w:val="center"/>
+            </w:pPr>
+            <w:r>
+              <w:rPr>
+                <w:rFonts w:ascii="Calibri" w:cs="Calibri" w:eastAsia="Calibri" w:hAnsi="Calibri"/>
+                <w:b w:val="false"/>
+                <w:bCs w:val="false"/>
+                <w:sz w:val="17"/>
+                <w:szCs w:val="17"/>
+              </w:rPr>
+              <w:t xml:space="preserve">User</w:t>
+            </w:r>
+          </w:p>
+        </w:tc>
+        <w:tc>
+          <w:tcPr>
+            <w:tcW w:type="dxa" w:w="2000"/>
+            <w:tcBorders>
+              <w:top w:val="single" w:color="BFBFBF" w:sz="4"/>
+              <w:left w:val="single" w:color="BFBFBF" w:sz="4"/>
+              <w:bottom w:val="single" w:color="BFBFBF" w:sz="4"/>
+              <w:right w:val="single" w:color="BFBFBF" w:sz="4"/>
+            </w:tcBorders>
+            <w:tcMar>
+              <w:top w:type="dxa" w:w="50"/>
+              <w:left w:type="dxa" w:w="80"/>
+              <w:bottom w:type="dxa" w:w="50"/>
+              <w:right w:type="dxa" w:w="80"/>
+            </w:tcMar>
+          </w:tcPr>
+          <w:p>
+            <w:pPr>
+              <w:jc w:val="center"/>
+            </w:pPr>
+            <w:r>
+              <w:rPr>
+                <w:rFonts w:ascii="Calibri" w:cs="Calibri" w:eastAsia="Calibri" w:hAnsi="Calibri"/>
+                <w:b w:val="false"/>
+                <w:bCs w:val="false"/>
+                <w:sz w:val="17"/>
+                <w:szCs w:val="17"/>
+              </w:rPr>
+              <w:t xml:space="preserve">Authors’ (unchanged)</w:t>
+            </w:r>
+          </w:p>
+        </w:tc>
+        <w:tc>
+          <w:tcPr>
+            <w:tcW w:type="dxa" w:w="1560"/>
+            <w:tcBorders>
+              <w:top w:val="single" w:color="BFBFBF" w:sz="4"/>
+              <w:left w:val="single" w:color="BFBFBF" w:sz="4"/>
+              <w:bottom w:val="single" w:color="BFBFBF" w:sz="4"/>
+              <w:right w:val="single" w:color="BFBFBF" w:sz="4"/>
+            </w:tcBorders>
+            <w:tcMar>
+              <w:top w:type="dxa" w:w="50"/>
+              <w:left w:type="dxa" w:w="80"/>
+              <w:bottom w:type="dxa" w:w="50"/>
+              <w:right w:type="dxa" w:w="80"/>
+            </w:tcMar>
+          </w:tcPr>
+          <w:p>
+            <w:pPr>
+              <w:jc w:val="center"/>
+            </w:pPr>
+            <w:r>
+              <w:rPr>
+                <w:rFonts w:ascii="Calibri" w:cs="Calibri" w:eastAsia="Calibri" w:hAnsi="Calibri"/>
+                <w:b w:val="false"/>
+                <w:bCs w:val="false"/>
+                <w:sz w:val="17"/>
+                <w:szCs w:val="17"/>
+              </w:rPr>
+              <w:t xml:space="preserve">Yes</w:t>
+            </w:r>
+          </w:p>
+        </w:tc>
+      </w:tr>
+      <w:tr>
+        <w:trPr>
+          <w:cantSplit/>
+        </w:trPr>
+        <w:tc>
+          <w:tcPr>
+            <w:tcW w:type="dxa" w:w="1500"/>
+            <w:tcBorders>
+              <w:top w:val="single" w:color="BFBFBF" w:sz="4"/>
+              <w:left w:val="single" w:color="BFBFBF" w:sz="4"/>
+              <w:bottom w:val="single" w:color="BFBFBF" w:sz="4"/>
+              <w:right w:val="single" w:color="BFBFBF" w:sz="4"/>
+            </w:tcBorders>
+            <w:shd w:fill="F7F7F7" w:color="auto" w:val="clear"/>
+            <w:tcMar>
+              <w:top w:type="dxa" w:w="50"/>
+              <w:left w:type="dxa" w:w="80"/>
+              <w:bottom w:type="dxa" w:w="50"/>
+              <w:right w:type="dxa" w:w="80"/>
+            </w:tcMar>
+          </w:tcPr>
+          <w:p>
+            <w:pPr>
+              <w:jc w:val="left"/>
+            </w:pPr>
+            <w:r>
+              <w:rPr>
+                <w:rFonts w:ascii="Calibri" w:cs="Calibri" w:eastAsia="Calibri" w:hAnsi="Calibri"/>
+                <w:b w:val="false"/>
+                <w:bCs w:val="false"/>
+                <w:sz w:val="17"/>
+                <w:szCs w:val="17"/>
+              </w:rPr>
+              <w:t xml:space="preserve">Instagram</w:t>
+            </w:r>
+          </w:p>
+        </w:tc>
+        <w:tc>
+          <w:tcPr>
+            <w:tcW w:type="dxa" w:w="2700"/>
+            <w:tcBorders>
+              <w:top w:val="single" w:color="BFBFBF" w:sz="4"/>
+              <w:left w:val="single" w:color="BFBFBF" w:sz="4"/>
+              <w:bottom w:val="single" w:color="BFBFBF" w:sz="4"/>
+              <w:right w:val="single" w:color="BFBFBF" w:sz="4"/>
+            </w:tcBorders>
+            <w:shd w:fill="F7F7F7" w:color="auto" w:val="clear"/>
+            <w:tcMar>
+              <w:top w:type="dxa" w:w="50"/>
+              <w:left w:type="dxa" w:w="80"/>
+              <w:bottom w:type="dxa" w:w="50"/>
+              <w:right w:type="dxa" w:w="80"/>
+            </w:tcMar>
+          </w:tcPr>
+          <w:p>
+            <w:pPr>
+              <w:jc w:val="center"/>
+            </w:pPr>
+            <w:r>
+              <w:rPr>
+                <w:rFonts w:ascii="Calibri" w:cs="Calibri" w:eastAsia="Calibri" w:hAnsi="Calibri"/>
+                <w:b w:val="false"/>
+                <w:bCs w:val="false"/>
+                <w:sz w:val="17"/>
+                <w:szCs w:val="17"/>
+              </w:rPr>
+              <w:t xml:space="preserve">Native (bio)</w:t>
+            </w:r>
+          </w:p>
+        </w:tc>
+        <w:tc>
+          <w:tcPr>
+            <w:tcW w:type="dxa" w:w="1600"/>
+            <w:tcBorders>
+              <w:top w:val="single" w:color="BFBFBF" w:sz="4"/>
+              <w:left w:val="single" w:color="BFBFBF" w:sz="4"/>
+              <w:bottom w:val="single" w:color="BFBFBF" w:sz="4"/>
+              <w:right w:val="single" w:color="BFBFBF" w:sz="4"/>
+            </w:tcBorders>
+            <w:shd w:fill="F7F7F7" w:color="auto" w:val="clear"/>
+            <w:tcMar>
+              <w:top w:type="dxa" w:w="50"/>
+              <w:left w:type="dxa" w:w="80"/>
+              <w:bottom w:type="dxa" w:w="50"/>
+              <w:right w:type="dxa" w:w="80"/>
+            </w:tcMar>
+          </w:tcPr>
+          <w:p>
+            <w:pPr>
+              <w:jc w:val="center"/>
+            </w:pPr>
+            <w:r>
+              <w:rPr>
+                <w:rFonts w:ascii="Calibri" w:cs="Calibri" w:eastAsia="Calibri" w:hAnsi="Calibri"/>
+                <w:b w:val="false"/>
+                <w:bCs w:val="false"/>
+                <w:sz w:val="17"/>
+                <w:szCs w:val="17"/>
+              </w:rPr>
+              <w:t xml:space="preserve">User</w:t>
+            </w:r>
+          </w:p>
+        </w:tc>
+        <w:tc>
+          <w:tcPr>
+            <w:tcW w:type="dxa" w:w="2000"/>
+            <w:tcBorders>
+              <w:top w:val="single" w:color="BFBFBF" w:sz="4"/>
+              <w:left w:val="single" w:color="BFBFBF" w:sz="4"/>
+              <w:bottom w:val="single" w:color="BFBFBF" w:sz="4"/>
+              <w:right w:val="single" w:color="BFBFBF" w:sz="4"/>
+            </w:tcBorders>
+            <w:shd w:fill="F7F7F7" w:color="auto" w:val="clear"/>
+            <w:tcMar>
+              <w:top w:type="dxa" w:w="50"/>
+              <w:left w:type="dxa" w:w="80"/>
+              <w:bottom w:type="dxa" w:w="50"/>
+              <w:right w:type="dxa" w:w="80"/>
+            </w:tcMar>
+          </w:tcPr>
+          <w:p>
+            <w:pPr>
+              <w:jc w:val="center"/>
+            </w:pPr>
+            <w:r>
+              <w:rPr>
+                <w:rFonts w:ascii="Calibri" w:cs="Calibri" w:eastAsia="Calibri" w:hAnsi="Calibri"/>
+                <w:b w:val="false"/>
+                <w:bCs w:val="false"/>
+                <w:sz w:val="17"/>
+                <w:szCs w:val="17"/>
+              </w:rPr>
+              <w:t xml:space="preserve">Authors’ (unchanged)</w:t>
+            </w:r>
+          </w:p>
+        </w:tc>
+        <w:tc>
+          <w:tcPr>
+            <w:tcW w:type="dxa" w:w="1560"/>
+            <w:tcBorders>
+              <w:top w:val="single" w:color="BFBFBF" w:sz="4"/>
+              <w:left w:val="single" w:color="BFBFBF" w:sz="4"/>
+              <w:bottom w:val="single" w:color="BFBFBF" w:sz="4"/>
+              <w:right w:val="single" w:color="BFBFBF" w:sz="4"/>
+            </w:tcBorders>
+            <w:shd w:fill="F7F7F7" w:color="auto" w:val="clear"/>
+            <w:tcMar>
+              <w:top w:type="dxa" w:w="50"/>
+              <w:left w:type="dxa" w:w="80"/>
+              <w:bottom w:type="dxa" w:w="50"/>
+              <w:right w:type="dxa" w:w="80"/>
+            </w:tcMar>
+          </w:tcPr>
+          <w:p>
+            <w:pPr>
+              <w:jc w:val="center"/>
+            </w:pPr>
+            <w:r>
+              <w:rPr>
+                <w:rFonts w:ascii="Calibri" w:cs="Calibri" w:eastAsia="Calibri" w:hAnsi="Calibri"/>
+                <w:b w:val="false"/>
+                <w:bCs w:val="false"/>
+                <w:sz w:val="17"/>
+                <w:szCs w:val="17"/>
+              </w:rPr>
+              <w:t xml:space="preserve">Yes</w:t>
+            </w:r>
+          </w:p>
+        </w:tc>
+      </w:tr>
+      <w:tr>
+        <w:trPr>
+          <w:cantSplit/>
+        </w:trPr>
+        <w:tc>
+          <w:tcPr>
+            <w:tcW w:type="dxa" w:w="1500"/>
+            <w:tcBorders>
+              <w:top w:val="single" w:color="BFBFBF" w:sz="4"/>
+              <w:left w:val="single" w:color="BFBFBF" w:sz="4"/>
+              <w:bottom w:val="single" w:color="BFBFBF" w:sz="4"/>
+              <w:right w:val="single" w:color="BFBFBF" w:sz="4"/>
+            </w:tcBorders>
+            <w:tcMar>
+              <w:top w:type="dxa" w:w="50"/>
+              <w:left w:type="dxa" w:w="80"/>
+              <w:bottom w:type="dxa" w:w="50"/>
+              <w:right w:type="dxa" w:w="80"/>
+            </w:tcMar>
+          </w:tcPr>
+          <w:p>
+            <w:pPr>
+              <w:jc w:val="left"/>
+            </w:pPr>
+            <w:r>
+              <w:rPr>
+                <w:rFonts w:ascii="Calibri" w:cs="Calibri" w:eastAsia="Calibri" w:hAnsi="Calibri"/>
+                <w:b w:val="false"/>
+                <w:bCs w:val="false"/>
+                <w:sz w:val="17"/>
+                <w:szCs w:val="17"/>
+              </w:rPr>
+              <w:t xml:space="preserve">Amazon</w:t>
+            </w:r>
+          </w:p>
+        </w:tc>
+        <w:tc>
+          <w:tcPr>
+            <w:tcW w:type="dxa" w:w="2700"/>
+            <w:tcBorders>
+              <w:top w:val="single" w:color="BFBFBF" w:sz="4"/>
+              <w:left w:val="single" w:color="BFBFBF" w:sz="4"/>
+              <w:bottom w:val="single" w:color="BFBFBF" w:sz="4"/>
+              <w:right w:val="single" w:color="BFBFBF" w:sz="4"/>
+            </w:tcBorders>
+            <w:tcMar>
+              <w:top w:type="dxa" w:w="50"/>
+              <w:left w:type="dxa" w:w="80"/>
+              <w:bottom w:type="dxa" w:w="50"/>
+              <w:right w:type="dxa" w:w="80"/>
+            </w:tcMar>
+          </w:tcPr>
+          <w:p>
+            <w:pPr>
+              <w:jc w:val="center"/>
+            </w:pPr>
+            <w:r>
+              <w:rPr>
+                <w:rFonts w:ascii="Calibri" w:cs="Calibri" w:eastAsia="Calibri" w:hAnsi="Calibri"/>
+                <w:b w:val="false"/>
+                <w:bCs w:val="false"/>
+                <w:sz w:val="17"/>
+                <w:szCs w:val="17"/>
+              </w:rPr>
+              <w:t xml:space="preserve">McAuley 2014 reviews, matched by proof</w:t>
+            </w:r>
+          </w:p>
+        </w:tc>
+        <w:tc>
+          <w:tcPr>
+            <w:tcW w:type="dxa" w:w="1600"/>
+            <w:tcBorders>
+              <w:top w:val="single" w:color="BFBFBF" w:sz="4"/>
+              <w:left w:val="single" w:color="BFBFBF" w:sz="4"/>
+              <w:bottom w:val="single" w:color="BFBFBF" w:sz="4"/>
+              <w:right w:val="single" w:color="BFBFBF" w:sz="4"/>
+            </w:tcBorders>
+            <w:tcMar>
+              <w:top w:type="dxa" w:w="50"/>
+              <w:left w:type="dxa" w:w="80"/>
+              <w:bottom w:type="dxa" w:w="50"/>
+              <w:right w:type="dxa" w:w="80"/>
+            </w:tcMar>
+          </w:tcPr>
+          <w:p>
+            <w:pPr>
+              <w:jc w:val="center"/>
+            </w:pPr>
+            <w:r>
+              <w:rPr>
+                <w:rFonts w:ascii="Calibri" w:cs="Calibri" w:eastAsia="Calibri" w:hAnsi="Calibri"/>
+                <w:b w:val="false"/>
+                <w:bCs w:val="false"/>
+                <w:sz w:val="17"/>
+                <w:szCs w:val="17"/>
+              </w:rPr>
+              <w:t xml:space="preserve">User (all reviews)</w:t>
+            </w:r>
+          </w:p>
+        </w:tc>
+        <w:tc>
+          <w:tcPr>
+            <w:tcW w:type="dxa" w:w="2000"/>
+            <w:tcBorders>
+              <w:top w:val="single" w:color="BFBFBF" w:sz="4"/>
+              <w:left w:val="single" w:color="BFBFBF" w:sz="4"/>
+              <w:bottom w:val="single" w:color="BFBFBF" w:sz="4"/>
+              <w:right w:val="single" w:color="BFBFBF" w:sz="4"/>
+            </w:tcBorders>
+            <w:tcMar>
+              <w:top w:type="dxa" w:w="50"/>
+              <w:left w:type="dxa" w:w="80"/>
+              <w:bottom w:type="dxa" w:w="50"/>
+              <w:right w:type="dxa" w:w="80"/>
+            </w:tcMar>
+          </w:tcPr>
+          <w:p>
+            <w:pPr>
+              <w:jc w:val="center"/>
+            </w:pPr>
+            <w:r>
+              <w:rPr>
+                <w:rFonts w:ascii="Calibri" w:cs="Calibri" w:eastAsia="Calibri" w:hAnsi="Calibri"/>
+                <w:b w:val="false"/>
+                <w:bCs w:val="false"/>
+                <w:sz w:val="17"/>
+                <w:szCs w:val="17"/>
+              </w:rPr>
+              <w:t xml:space="preserve">Ours, mirroring Reddit</w:t>
+            </w:r>
+          </w:p>
+        </w:tc>
+        <w:tc>
+          <w:tcPr>
+            <w:tcW w:type="dxa" w:w="1560"/>
+            <w:tcBorders>
+              <w:top w:val="single" w:color="BFBFBF" w:sz="4"/>
+              <w:left w:val="single" w:color="BFBFBF" w:sz="4"/>
+              <w:bottom w:val="single" w:color="BFBFBF" w:sz="4"/>
+              <w:right w:val="single" w:color="BFBFBF" w:sz="4"/>
+            </w:tcBorders>
+            <w:tcMar>
+              <w:top w:type="dxa" w:w="50"/>
+              <w:left w:type="dxa" w:w="80"/>
+              <w:bottom w:type="dxa" w:w="50"/>
+              <w:right w:type="dxa" w:w="80"/>
+            </w:tcMar>
+          </w:tcPr>
+          <w:p>
+            <w:pPr>
+              <w:jc w:val="center"/>
+            </w:pPr>
+            <w:r>
+              <w:rPr>
+                <w:rFonts w:ascii="Calibri" w:cs="Calibri" w:eastAsia="Calibri" w:hAnsi="Calibri"/>
+                <w:b w:val="false"/>
+                <w:bCs w:val="false"/>
+                <w:sz w:val="17"/>
+                <w:szCs w:val="17"/>
+              </w:rPr>
+              <w:t xml:space="preserve">No</w:t>
+            </w:r>
+          </w:p>
+        </w:tc>
+      </w:tr>
+      <w:tr>
+        <w:trPr>
+          <w:cantSplit/>
+        </w:trPr>
+        <w:tc>
+          <w:tcPr>
+            <w:tcW w:type="dxa" w:w="1500"/>
+            <w:tcBorders>
+              <w:top w:val="single" w:color="BFBFBF" w:sz="4"/>
+              <w:left w:val="single" w:color="BFBFBF" w:sz="4"/>
+              <w:bottom w:val="single" w:color="BFBFBF" w:sz="4"/>
+              <w:right w:val="single" w:color="BFBFBF" w:sz="4"/>
+            </w:tcBorders>
+            <w:shd w:fill="F7F7F7" w:color="auto" w:val="clear"/>
+            <w:tcMar>
+              <w:top w:type="dxa" w:w="50"/>
+              <w:left w:type="dxa" w:w="80"/>
+              <w:bottom w:type="dxa" w:w="50"/>
+              <w:right w:type="dxa" w:w="80"/>
+            </w:tcMar>
+          </w:tcPr>
+          <w:p>
+            <w:pPr>
+              <w:jc w:val="left"/>
+            </w:pPr>
+            <w:r>
+              <w:rPr>
+                <w:rFonts w:ascii="Calibri" w:cs="Calibri" w:eastAsia="Calibri" w:hAnsi="Calibri"/>
+                <w:b w:val="false"/>
+                <w:bCs w:val="false"/>
+                <w:sz w:val="17"/>
+                <w:szCs w:val="17"/>
+              </w:rPr>
+              <w:t xml:space="preserve">YelpChi</w:t>
+            </w:r>
+          </w:p>
+        </w:tc>
+        <w:tc>
+          <w:tcPr>
+            <w:tcW w:type="dxa" w:w="2700"/>
+            <w:tcBorders>
+              <w:top w:val="single" w:color="BFBFBF" w:sz="4"/>
+              <w:left w:val="single" w:color="BFBFBF" w:sz="4"/>
+              <w:bottom w:val="single" w:color="BFBFBF" w:sz="4"/>
+              <w:right w:val="single" w:color="BFBFBF" w:sz="4"/>
+            </w:tcBorders>
+            <w:shd w:fill="F7F7F7" w:color="auto" w:val="clear"/>
+            <w:tcMar>
+              <w:top w:type="dxa" w:w="50"/>
+              <w:left w:type="dxa" w:w="80"/>
+              <w:bottom w:type="dxa" w:w="50"/>
+              <w:right w:type="dxa" w:w="80"/>
+            </w:tcMar>
+          </w:tcPr>
+          <w:p>
+            <w:pPr>
+              <w:jc w:val="center"/>
+            </w:pPr>
+            <w:r>
+              <w:rPr>
+                <w:rFonts w:ascii="Calibri" w:cs="Calibri" w:eastAsia="Calibri" w:hAnsi="Calibri"/>
+                <w:b w:val="false"/>
+                <w:bCs w:val="false"/>
+                <w:sz w:val="17"/>
+                <w:szCs w:val="17"/>
+              </w:rPr>
+              <w:t xml:space="preserve">Mukherjee 2013 corpus, positional join</w:t>
+            </w:r>
+          </w:p>
+        </w:tc>
+        <w:tc>
+          <w:tcPr>
+            <w:tcW w:type="dxa" w:w="1600"/>
+            <w:tcBorders>
+              <w:top w:val="single" w:color="BFBFBF" w:sz="4"/>
+              <w:left w:val="single" w:color="BFBFBF" w:sz="4"/>
+              <w:bottom w:val="single" w:color="BFBFBF" w:sz="4"/>
+              <w:right w:val="single" w:color="BFBFBF" w:sz="4"/>
+            </w:tcBorders>
+            <w:shd w:fill="F7F7F7" w:color="auto" w:val="clear"/>
+            <w:tcMar>
+              <w:top w:type="dxa" w:w="50"/>
+              <w:left w:type="dxa" w:w="80"/>
+              <w:bottom w:type="dxa" w:w="50"/>
+              <w:right w:type="dxa" w:w="80"/>
+            </w:tcMar>
+          </w:tcPr>
+          <w:p>
+            <w:pPr>
+              <w:jc w:val="center"/>
+            </w:pPr>
+            <w:r>
+              <w:rPr>
+                <w:rFonts w:ascii="Calibri" w:cs="Calibri" w:eastAsia="Calibri" w:hAnsi="Calibri"/>
+                <w:b w:val="false"/>
+                <w:bCs w:val="false"/>
+                <w:sz w:val="17"/>
+                <w:szCs w:val="17"/>
+              </w:rPr>
+              <w:t xml:space="preserve">Review</w:t>
+            </w:r>
+          </w:p>
+        </w:tc>
+        <w:tc>
+          <w:tcPr>
+            <w:tcW w:type="dxa" w:w="2000"/>
+            <w:tcBorders>
+              <w:top w:val="single" w:color="BFBFBF" w:sz="4"/>
+              <w:left w:val="single" w:color="BFBFBF" w:sz="4"/>
+              <w:bottom w:val="single" w:color="BFBFBF" w:sz="4"/>
+              <w:right w:val="single" w:color="BFBFBF" w:sz="4"/>
+            </w:tcBorders>
+            <w:shd w:fill="F7F7F7" w:color="auto" w:val="clear"/>
+            <w:tcMar>
+              <w:top w:type="dxa" w:w="50"/>
+              <w:left w:type="dxa" w:w="80"/>
+              <w:bottom w:type="dxa" w:w="50"/>
+              <w:right w:type="dxa" w:w="80"/>
+            </w:tcMar>
+          </w:tcPr>
+          <w:p>
+            <w:pPr>
+              <w:jc w:val="center"/>
+            </w:pPr>
+            <w:r>
+              <w:rPr>
+                <w:rFonts w:ascii="Calibri" w:cs="Calibri" w:eastAsia="Calibri" w:hAnsi="Calibri"/>
+                <w:b w:val="false"/>
+                <w:bCs w:val="false"/>
+                <w:sz w:val="17"/>
+                <w:szCs w:val="17"/>
+              </w:rPr>
+              <w:t xml:space="preserve">Ours, mirroring Reddit</w:t>
+            </w:r>
+          </w:p>
+        </w:tc>
+        <w:tc>
+          <w:tcPr>
+            <w:tcW w:type="dxa" w:w="1560"/>
+            <w:tcBorders>
+              <w:top w:val="single" w:color="BFBFBF" w:sz="4"/>
+              <w:left w:val="single" w:color="BFBFBF" w:sz="4"/>
+              <w:bottom w:val="single" w:color="BFBFBF" w:sz="4"/>
+              <w:right w:val="single" w:color="BFBFBF" w:sz="4"/>
+            </w:tcBorders>
+            <w:shd w:fill="F7F7F7" w:color="auto" w:val="clear"/>
+            <w:tcMar>
+              <w:top w:type="dxa" w:w="50"/>
+              <w:left w:type="dxa" w:w="80"/>
+              <w:bottom w:type="dxa" w:w="50"/>
+              <w:right w:type="dxa" w:w="80"/>
+            </w:tcMar>
+          </w:tcPr>
+          <w:p>
+            <w:pPr>
+              <w:jc w:val="center"/>
+            </w:pPr>
+            <w:r>
+              <w:rPr>
+                <w:rFonts w:ascii="Calibri" w:cs="Calibri" w:eastAsia="Calibri" w:hAnsi="Calibri"/>
+                <w:b w:val="false"/>
+                <w:bCs w:val="false"/>
+                <w:sz w:val="17"/>
+                <w:szCs w:val="17"/>
+              </w:rPr>
+              <w:t xml:space="preserve">No</w:t>
+            </w:r>
+          </w:p>
+        </w:tc>
+      </w:tr>
+      <w:tr>
+        <w:trPr>
+          <w:cantSplit/>
+        </w:trPr>
+        <w:tc>
+          <w:tcPr>
+            <w:tcW w:type="dxa" w:w="1500"/>
+            <w:tcBorders>
+              <w:top w:val="single" w:color="BFBFBF" w:sz="4"/>
+              <w:left w:val="single" w:color="BFBFBF" w:sz="4"/>
+              <w:bottom w:val="single" w:color="BFBFBF" w:sz="4"/>
+              <w:right w:val="single" w:color="BFBFBF" w:sz="4"/>
+            </w:tcBorders>
+            <w:tcMar>
+              <w:top w:type="dxa" w:w="50"/>
+              <w:left w:type="dxa" w:w="80"/>
+              <w:bottom w:type="dxa" w:w="50"/>
+              <w:right w:type="dxa" w:w="80"/>
+            </w:tcMar>
+          </w:tcPr>
+          <w:p>
+            <w:pPr>
+              <w:jc w:val="left"/>
+            </w:pPr>
+            <w:r>
+              <w:rPr>
+                <w:rFonts w:ascii="Calibri" w:cs="Calibri" w:eastAsia="Calibri" w:hAnsi="Calibri"/>
+                <w:b w:val="false"/>
+                <w:bCs w:val="false"/>
+                <w:sz w:val="17"/>
+                <w:szCs w:val="17"/>
+              </w:rPr>
+              <w:t xml:space="preserve">Amazon Video</w:t>
+            </w:r>
+          </w:p>
+        </w:tc>
+        <w:tc>
+          <w:tcPr>
+            <w:tcW w:type="dxa" w:w="2700"/>
+            <w:tcBorders>
+              <w:top w:val="single" w:color="BFBFBF" w:sz="4"/>
+              <w:left w:val="single" w:color="BFBFBF" w:sz="4"/>
+              <w:bottom w:val="single" w:color="BFBFBF" w:sz="4"/>
+              <w:right w:val="single" w:color="BFBFBF" w:sz="4"/>
+            </w:tcBorders>
+            <w:tcMar>
+              <w:top w:type="dxa" w:w="50"/>
+              <w:left w:type="dxa" w:w="80"/>
+              <w:bottom w:type="dxa" w:w="50"/>
+              <w:right w:type="dxa" w:w="80"/>
+            </w:tcMar>
+          </w:tcPr>
+          <w:p>
+            <w:pPr>
+              <w:jc w:val="center"/>
+            </w:pPr>
+            <w:r>
+              <w:rPr>
+                <w:rFonts w:ascii="Calibri" w:cs="Calibri" w:eastAsia="Calibri" w:hAnsi="Calibri"/>
+                <w:b w:val="false"/>
+                <w:bCs w:val="false"/>
+                <w:sz w:val="17"/>
+                <w:szCs w:val="17"/>
+              </w:rPr>
+              <w:t xml:space="preserve">McAuley 2014 reviews, built by us</w:t>
+            </w:r>
+          </w:p>
+        </w:tc>
+        <w:tc>
+          <w:tcPr>
+            <w:tcW w:type="dxa" w:w="1600"/>
+            <w:tcBorders>
+              <w:top w:val="single" w:color="BFBFBF" w:sz="4"/>
+              <w:left w:val="single" w:color="BFBFBF" w:sz="4"/>
+              <w:bottom w:val="single" w:color="BFBFBF" w:sz="4"/>
+              <w:right w:val="single" w:color="BFBFBF" w:sz="4"/>
+            </w:tcBorders>
+            <w:tcMar>
+              <w:top w:type="dxa" w:w="50"/>
+              <w:left w:type="dxa" w:w="80"/>
+              <w:bottom w:type="dxa" w:w="50"/>
+              <w:right w:type="dxa" w:w="80"/>
+            </w:tcMar>
+          </w:tcPr>
+          <w:p>
+            <w:pPr>
+              <w:jc w:val="center"/>
+            </w:pPr>
+            <w:r>
+              <w:rPr>
+                <w:rFonts w:ascii="Calibri" w:cs="Calibri" w:eastAsia="Calibri" w:hAnsi="Calibri"/>
+                <w:b w:val="false"/>
+                <w:bCs w:val="false"/>
+                <w:sz w:val="17"/>
+                <w:szCs w:val="17"/>
+              </w:rPr>
+              <w:t xml:space="preserve">User (all reviews)</w:t>
+            </w:r>
+          </w:p>
+        </w:tc>
+        <w:tc>
+          <w:tcPr>
+            <w:tcW w:type="dxa" w:w="2000"/>
+            <w:tcBorders>
+              <w:top w:val="single" w:color="BFBFBF" w:sz="4"/>
+              <w:left w:val="single" w:color="BFBFBF" w:sz="4"/>
+              <w:bottom w:val="single" w:color="BFBFBF" w:sz="4"/>
+              <w:right w:val="single" w:color="BFBFBF" w:sz="4"/>
+            </w:tcBorders>
+            <w:tcMar>
+              <w:top w:type="dxa" w:w="50"/>
+              <w:left w:type="dxa" w:w="80"/>
+              <w:bottom w:type="dxa" w:w="50"/>
+              <w:right w:type="dxa" w:w="80"/>
+            </w:tcMar>
+          </w:tcPr>
+          <w:p>
+            <w:pPr>
+              <w:jc w:val="center"/>
+            </w:pPr>
+            <w:r>
+              <w:rPr>
+                <w:rFonts w:ascii="Calibri" w:cs="Calibri" w:eastAsia="Calibri" w:hAnsi="Calibri"/>
+                <w:b w:val="false"/>
+                <w:bCs w:val="false"/>
+                <w:sz w:val="17"/>
+                <w:szCs w:val="17"/>
+              </w:rPr>
+              <w:t xml:space="preserve">Amazon’s, copied</w:t>
+            </w:r>
+          </w:p>
+        </w:tc>
+        <w:tc>
+          <w:tcPr>
+            <w:tcW w:type="dxa" w:w="1560"/>
+            <w:tcBorders>
+              <w:top w:val="single" w:color="BFBFBF" w:sz="4"/>
+              <w:left w:val="single" w:color="BFBFBF" w:sz="4"/>
+              <w:bottom w:val="single" w:color="BFBFBF" w:sz="4"/>
+              <w:right w:val="single" w:color="BFBFBF" w:sz="4"/>
+            </w:tcBorders>
+            <w:tcMar>
+              <w:top w:type="dxa" w:w="50"/>
+              <w:left w:type="dxa" w:w="80"/>
+              <w:bottom w:type="dxa" w:w="50"/>
+              <w:right w:type="dxa" w:w="80"/>
+            </w:tcMar>
+          </w:tcPr>
+          <w:p>
+            <w:pPr>
+              <w:jc w:val="center"/>
+            </w:pPr>
+            <w:r>
+              <w:rPr>
+                <w:rFonts w:ascii="Calibri" w:cs="Calibri" w:eastAsia="Calibri" w:hAnsi="Calibri"/>
+                <w:b w:val="false"/>
+                <w:bCs w:val="false"/>
+                <w:sz w:val="17"/>
+                <w:szCs w:val="17"/>
+              </w:rPr>
+              <w:t xml:space="preserve">No</w:t>
+            </w:r>
+          </w:p>
+        </w:tc>
+      </w:tr>
+    </w:tbl>
+    <w:p>
+      <w:pPr>
+        <w:spacing w:after="120" w:before="120"/>
+      </w:pPr>
+      <w:r>
+        <w:rPr>
+          <w:rFonts w:ascii="Calibri" w:cs="Calibri" w:eastAsia="Calibri" w:hAnsi="Calibri"/>
+          <w:sz w:val="22"/>
+          <w:szCs w:val="22"/>
+        </w:rPr>
+        <w:t xml:space="preserve">For Amazon, YelpChi and Amazon Video the original FLAG authors’ pipeline was not run. We applied the same method (cosine sampling and the discriminative and residual prompts) to text we attached ourselves. Results on these datasets are new experiments, not reproductions. Differences between FLAG and the baseline there also reflect the change of input from engineered features to text (Section 4.3).</w:t>
+      </w:r>
+    </w:p>
+    <w:p>
+      <w:pPr>
+        <w:pStyle w:val="Heading1"/>
+        <w:spacing w:after="140" w:before="300"/>
+      </w:pPr>
+      <w:r>
+        <w:rPr>
+          <w:rFonts w:ascii="Calibri" w:cs="Calibri" w:eastAsia="Calibri" w:hAnsi="Calibri"/>
+          <w:b/>
+          <w:bCs/>
+          <w:color w:val="1F3864"/>
+          <w:sz w:val="32"/>
+          <w:szCs w:val="32"/>
+        </w:rPr>
+        <w:t xml:space="preserve">4. Main results</w:t>
+      </w:r>
+    </w:p>
+    <w:p>
+      <w:pPr>
+        <w:pStyle w:val="Heading2"/>
+        <w:spacing w:after="100" w:before="200"/>
+      </w:pPr>
+      <w:r>
+        <w:rPr>
+          <w:rFonts w:ascii="Calibri" w:cs="Calibri" w:eastAsia="Calibri" w:hAnsi="Calibri"/>
+          <w:b/>
+          <w:bCs/>
+          <w:color w:val="2F5496"/>
+          <w:sz w:val="26"/>
+          <w:szCs w:val="26"/>
+        </w:rPr>
+        <w:t xml:space="preserve">4.1 Mean test AUC and F1-macro over the seven backbones</w:t>
       </w:r>
     </w:p>
     <w:p>
@@ -5523,7 +8203,7 @@
           <w:sz w:val="26"/>
           <w:szCs w:val="26"/>
         </w:rPr>
-        <w:t xml:space="preserve">3.2 Fraud-class recall and precision</w:t>
+        <w:t xml:space="preserve">4.2 Fraud-class recall and precision</w:t>
       </w:r>
     </w:p>
     <w:p>
@@ -8028,7 +10708,7 @@
           <w:sz w:val="26"/>
           <w:szCs w:val="26"/>
         </w:rPr>
-        <w:t xml:space="preserve">3.3 Engineered-feature datasets: scaled features and text</w:t>
+        <w:t xml:space="preserve">4.3 Engineered-feature datasets: scaled features and text</w:t>
       </w:r>
     </w:p>
     <w:p>
@@ -8915,7 +11595,7 @@
           <w:sz w:val="32"/>
           <w:szCs w:val="32"/>
         </w:rPr>
-        <w:t xml:space="preserve">4. Comparisons</w:t>
+        <w:t xml:space="preserve">5. Comparisons</w:t>
       </w:r>
     </w:p>
     <w:p>
@@ -8932,7 +11612,7 @@
           <w:sz w:val="26"/>
           <w:szCs w:val="26"/>
         </w:rPr>
-        <w:t xml:space="preserve">4.1 MD vs cosine, with and without fine-tune</w:t>
+        <w:t xml:space="preserve">5.1 MD vs cosine, with and without fine-tune</w:t>
       </w:r>
     </w:p>
     <w:p>
@@ -10281,7 +12961,7 @@
           <w:sz w:val="26"/>
           <w:szCs w:val="26"/>
         </w:rPr>
-        <w:t xml:space="preserve">4.2 Fine-tune vs no fine-tune</w:t>
+        <w:t xml:space="preserve">5.2 Fine-tune vs no fine-tune</w:t>
       </w:r>
     </w:p>
     <w:p>
@@ -10964,7 +13644,7 @@
           <w:sz w:val="26"/>
           <w:szCs w:val="26"/>
         </w:rPr>
-        <w:t xml:space="preserve">4.3 FLAG vs baseline and vs raw text</w:t>
+        <w:t xml:space="preserve">5.3 FLAG vs baseline and vs raw text</w:t>
       </w:r>
     </w:p>
     <w:p>
@@ -12371,7 +15051,7 @@
           <w:sz w:val="26"/>
           <w:szCs w:val="26"/>
         </w:rPr>
-        <w:t xml:space="preserve">4.4 Comparison with the published paper</w:t>
+        <w:t xml:space="preserve">5.4 Comparison with the published paper</w:t>
       </w:r>
     </w:p>
     <w:p>
@@ -13296,7 +15976,7 @@
           <w:sz w:val="32"/>
           <w:szCs w:val="32"/>
         </w:rPr>
-        <w:t xml:space="preserve">5. Limits</w:t>
+        <w:t xml:space="preserve">6. Limits</w:t>
       </w:r>
     </w:p>
     <w:p>

</xml_diff>